<commit_message>
build(dist): rebuild chuong_5 docx after P7 data corrections
https://claude.ai/code/session_01GMFmEtt6FYiJ4MKzBNCLqb
</commit_message>
<xml_diff>
--- a/dist/luan_an_ctu/chuong_5_ket_luan_de_xuat_vi.docx
+++ b/dist/luan_an_ctu/chuong_5_ket_luan_de_xuat_vi.docx
@@ -159,11 +159,30 @@
           <m:t>=</m:t>
         </m:r>
         <m:r>
-          <m:t>36.137</m:t>
+          <m:t>84.910</m:t>
         </m:r>
       </m:oMath>
       <w:r>
-        <w:t xml:space="preserve">) — đều chỉ đến cùng một kết luận: điểm uốn (turning point) của quan hệ I→P tăng dần theo chiều từ SIDS/Frontier lên Emerging, Upper-middle, Advanced Resource, và Advanced Innovation.</w:t>
+        <w:t xml:space="preserve"> </w:t>
+      </w:r>
+      <w:r>
+        <w:t xml:space="preserve">quan sát từ 49 nền kinh tế) — đều chỉ đến cùng một kết luận: điểm uốn (turning point) của quan hệ I→P</w:t>
+      </w:r>
+      <w:r>
+        <w:t xml:space="preserve"> </w:t>
+      </w:r>
+      <w:r>
+        <w:rPr>
+          <w:bCs/>
+          <w:b/>
+        </w:rPr>
+        <w:t xml:space="preserve">giảm dần</w:t>
+      </w:r>
+      <w:r>
+        <w:t xml:space="preserve"> </w:t>
+      </w:r>
+      <w:r>
+        <w:t xml:space="preserve">từ SIDS/Frontier (~55% FSTS) xuống Emerging, Upper-middle, Advanced Resource, và Advanced Innovation (~28% FSTS). Hay nói cách khác, nền kinh tế thể chế mạnh hơn đạt đỉnh hiệu quả xuất khẩu tại mức FSTS thấp hơn — doanh nghiệp không cần quốc tế hóa sâu để khai thác lợi thế cạnh tranh khi thể chế hỗ trợ đã vận hành tốt.</w:t>
       </w:r>
     </w:p>
     <w:p>
@@ -239,7 +258,52 @@
         <w:pStyle w:val="FirstParagraph"/>
       </w:pPr>
       <w:r>
-        <w:t xml:space="preserve">Technological Capability Index (TCI) nhất quán cho thấy tác động điều tiết dương trong các mẫu có đủ quy mô để phát hiện hiệu ứng (Việt Nam P3, toàn mẫu P7). Điều này xác nhận vai trò của TCI là</w:t>
+        <w:t xml:space="preserve">Technological Capability Index (TCI) nhất quán cho thấy</w:t>
+      </w:r>
+      <w:r>
+        <w:t xml:space="preserve"> </w:t>
+      </w:r>
+      <w:r>
+        <w:rPr>
+          <w:bCs/>
+          <w:b/>
+        </w:rPr>
+        <w:t xml:space="preserve">hiệu ứng nâng mặt bằng năng suất dương</w:t>
+      </w:r>
+      <w:r>
+        <w:t xml:space="preserve"> </w:t>
+      </w:r>
+      <w:r>
+        <w:t xml:space="preserve">trong tất cả các mẫu (Việt Nam P3, Trung Quốc P5, toàn mẫu P7: ~41% tăng năng suất cho mỗi đơn vị độ lệch chuẩn TCI). Tuy nhiên, TCI chỉ</w:t>
+      </w:r>
+      <w:r>
+        <w:t xml:space="preserve"> </w:t>
+      </w:r>
+      <w:r>
+        <w:rPr>
+          <w:bCs/>
+          <w:b/>
+        </w:rPr>
+        <w:t xml:space="preserve">điều tiết hình dạng đường cong I→P</w:t>
+      </w:r>
+      <w:r>
+        <w:t xml:space="preserve"> </w:t>
+      </w:r>
+      <w:r>
+        <w:t xml:space="preserve">tại bối cảnh quốc gia cụ thể (P3 Việt Nam — môi trường chuyển đổi với phân mảnh thể chế tạo điều kiện cho TCI reshaping hiệu ứng), không phổ quát trên toàn mẫu 49 nền kinh tế (P7: tương tác FSTS×TCI và FSTS²×TCI đều NS). H2 được</w:t>
+      </w:r>
+      <w:r>
+        <w:t xml:space="preserve"> </w:t>
+      </w:r>
+      <w:r>
+        <w:rPr>
+          <w:bCs/>
+          <w:b/>
+        </w:rPr>
+        <w:t xml:space="preserve">xác nhận một phần</w:t>
+      </w:r>
+      <w:r>
+        <w:t xml:space="preserve">: TCI là năng lực nền tảng phổ quát, nhưng vai trò uốn đường cong I→P phụ thuộc bối cảnh thể chế. Điều này xác nhận vai trò của TCI là</w:t>
       </w:r>
       <w:r>
         <w:t xml:space="preserve"> </w:t>
@@ -281,7 +345,401 @@
         <w:pStyle w:val="FirstParagraph"/>
       </w:pPr>
       <w:r>
-        <w:t xml:space="preserve">Kết quả về Digital Adoption Index (DAI) phức tạp hơn và có nhiều sắc thái hơn so với TCI. DAI chỉ phát huy vai trò điều tiết có ý nghĩa tại Singapore (P4, với DAI Tier-1+2) và trong nhóm Advanced tại P7 — tức là trong các bối cảnh ICRV nơi cơ sở hạ tầng số và hệ sinh thái số đã đủ trưởng thành. Tại các bối cảnh ICRV thấp hơn (Việt Nam P3, Frontier, SIDS trong P7), DAI không đạt ý nghĩa thống kê.</w:t>
+        <w:t xml:space="preserve">Kết quả về Digital Adoption Index (DAI) phức tạp hơn và có nhiều sắc thái hơn so với TCI. Trên toàn mẫu P7 (49 nền kinh tế), DAI có hiệu ứng nâng mặt bằng năng suất dương và có ý nghĩa (</w:t>
+      </w:r>
+      <m:oMath>
+        <m:acc>
+          <m:accPr>
+            <m:chr m:val="̂"/>
+          </m:accPr>
+          <m:e>
+            <m:r>
+              <m:t>β</m:t>
+            </m:r>
+          </m:e>
+        </m:acc>
+        <m:r>
+          <m:rPr>
+            <m:sty m:val="p"/>
+          </m:rPr>
+          <m:t>=</m:t>
+        </m:r>
+        <m:r>
+          <m:rPr>
+            <m:sty m:val="p"/>
+          </m:rPr>
+          <m:t>+</m:t>
+        </m:r>
+        <m:r>
+          <m:t>0</m:t>
+        </m:r>
+        <m:r>
+          <m:rPr>
+            <m:sty m:val="p"/>
+          </m:rPr>
+          <m:t>,</m:t>
+        </m:r>
+        <m:r>
+          <m:t>155</m:t>
+        </m:r>
+      </m:oMath>
+      <w:r>
+        <w:t xml:space="preserve">,</w:t>
+      </w:r>
+      <w:r>
+        <w:t xml:space="preserve"> </w:t>
+      </w:r>
+      <m:oMath>
+        <m:r>
+          <m:t>p</m:t>
+        </m:r>
+        <m:r>
+          <m:rPr>
+            <m:sty m:val="p"/>
+          </m:rPr>
+          <m:t>&lt;</m:t>
+        </m:r>
+        <m:r>
+          <m:rPr>
+            <m:sty m:val="p"/>
+          </m:rPr>
+          <m:t>,</m:t>
+        </m:r>
+        <m:r>
+          <m:t>001</m:t>
+        </m:r>
+      </m:oMath>
+      <w:r>
+        <w:t xml:space="preserve">) — khoảng 17% lợi thế năng suất cho doanh nghiệp có website. Quan trọng hơn, cả hai tương tác điều tiết đường cong đều có ý nghĩa (</w:t>
+      </w:r>
+      <m:oMath>
+        <m:acc>
+          <m:accPr>
+            <m:chr m:val="̂"/>
+          </m:accPr>
+          <m:e>
+            <m:r>
+              <m:t>β</m:t>
+            </m:r>
+          </m:e>
+        </m:acc>
+        <m:d>
+          <m:dPr>
+            <m:begChr m:val="("/>
+            <m:endChr m:val=")"/>
+            <m:sepChr m:val=""/>
+            <m:grow/>
+          </m:dPr>
+          <m:e>
+            <m:r>
+              <m:rPr>
+                <m:nor/>
+                <m:sty m:val="p"/>
+              </m:rPr>
+              <m:t>FSTS</m:t>
+            </m:r>
+            <m:r>
+              <m:rPr>
+                <m:sty m:val="p"/>
+              </m:rPr>
+              <m:t>×</m:t>
+            </m:r>
+            <m:r>
+              <m:rPr>
+                <m:nor/>
+                <m:sty m:val="p"/>
+              </m:rPr>
+              <m:t>DAI</m:t>
+            </m:r>
+          </m:e>
+        </m:d>
+        <m:r>
+          <m:rPr>
+            <m:sty m:val="p"/>
+          </m:rPr>
+          <m:t>=</m:t>
+        </m:r>
+        <m:r>
+          <m:rPr>
+            <m:sty m:val="p"/>
+          </m:rPr>
+          <m:t>−</m:t>
+        </m:r>
+        <m:r>
+          <m:t>0</m:t>
+        </m:r>
+        <m:r>
+          <m:rPr>
+            <m:sty m:val="p"/>
+          </m:rPr>
+          <m:t>,</m:t>
+        </m:r>
+        <m:r>
+          <m:t>614</m:t>
+        </m:r>
+      </m:oMath>
+      <w:r>
+        <w:t xml:space="preserve">,</w:t>
+      </w:r>
+      <w:r>
+        <w:t xml:space="preserve"> </w:t>
+      </w:r>
+      <m:oMath>
+        <m:r>
+          <m:t>p</m:t>
+        </m:r>
+        <m:r>
+          <m:rPr>
+            <m:sty m:val="p"/>
+          </m:rPr>
+          <m:t>&lt;</m:t>
+        </m:r>
+        <m:r>
+          <m:rPr>
+            <m:sty m:val="p"/>
+          </m:rPr>
+          <m:t>,</m:t>
+        </m:r>
+        <m:r>
+          <m:t>001</m:t>
+        </m:r>
+      </m:oMath>
+      <w:r>
+        <w:t xml:space="preserve">;</w:t>
+      </w:r>
+      <w:r>
+        <w:t xml:space="preserve"> </w:t>
+      </w:r>
+      <m:oMath>
+        <m:acc>
+          <m:accPr>
+            <m:chr m:val="̂"/>
+          </m:accPr>
+          <m:e>
+            <m:r>
+              <m:t>β</m:t>
+            </m:r>
+          </m:e>
+        </m:acc>
+        <m:d>
+          <m:dPr>
+            <m:begChr m:val="("/>
+            <m:endChr m:val=")"/>
+            <m:sepChr m:val=""/>
+            <m:grow/>
+          </m:dPr>
+          <m:e>
+            <m:sSup>
+              <m:e>
+                <m:r>
+                  <m:rPr>
+                    <m:nor/>
+                    <m:sty m:val="p"/>
+                  </m:rPr>
+                  <m:t>FSTS</m:t>
+                </m:r>
+              </m:e>
+              <m:sup>
+                <m:r>
+                  <m:t>2</m:t>
+                </m:r>
+              </m:sup>
+            </m:sSup>
+            <m:r>
+              <m:rPr>
+                <m:sty m:val="p"/>
+              </m:rPr>
+              <m:t>×</m:t>
+            </m:r>
+            <m:r>
+              <m:rPr>
+                <m:nor/>
+                <m:sty m:val="p"/>
+              </m:rPr>
+              <m:t>DAI</m:t>
+            </m:r>
+          </m:e>
+        </m:d>
+        <m:r>
+          <m:rPr>
+            <m:sty m:val="p"/>
+          </m:rPr>
+          <m:t>=</m:t>
+        </m:r>
+        <m:r>
+          <m:rPr>
+            <m:sty m:val="p"/>
+          </m:rPr>
+          <m:t>+</m:t>
+        </m:r>
+        <m:r>
+          <m:t>0</m:t>
+        </m:r>
+        <m:r>
+          <m:rPr>
+            <m:sty m:val="p"/>
+          </m:rPr>
+          <m:t>,</m:t>
+        </m:r>
+        <m:r>
+          <m:t>766</m:t>
+        </m:r>
+      </m:oMath>
+      <w:r>
+        <w:t xml:space="preserve">,</w:t>
+      </w:r>
+      <w:r>
+        <w:t xml:space="preserve"> </w:t>
+      </w:r>
+      <m:oMath>
+        <m:r>
+          <m:t>p</m:t>
+        </m:r>
+        <m:r>
+          <m:rPr>
+            <m:sty m:val="p"/>
+          </m:rPr>
+          <m:t>&lt;</m:t>
+        </m:r>
+        <m:r>
+          <m:rPr>
+            <m:sty m:val="p"/>
+          </m:rPr>
+          <m:t>,</m:t>
+        </m:r>
+        <m:r>
+          <m:t>01</m:t>
+        </m:r>
+      </m:oMath>
+      <w:r>
+        <w:t xml:space="preserve">), cho thấy doanh nghiệp DAI cao có đường cong I→P phẳng hơn và ít suy giảm hơn ở mức FSTS cao. Kết quả tương tác DAI×ICRV (</w:t>
+      </w:r>
+      <m:oMath>
+        <m:r>
+          <m:t>p</m:t>
+        </m:r>
+        <m:r>
+          <m:rPr>
+            <m:sty m:val="p"/>
+          </m:rPr>
+          <m:t>=</m:t>
+        </m:r>
+        <m:r>
+          <m:rPr>
+            <m:sty m:val="p"/>
+          </m:rPr>
+          <m:t>,</m:t>
+        </m:r>
+        <m:r>
+          <m:t>012</m:t>
+        </m:r>
+      </m:oMath>
+      <w:r>
+        <w:t xml:space="preserve">) xác nhận DAI phát huy hiệu quả mạnh hơn tại các bối cảnh thể chế yếu hơn — nhất quán với lập luận CDCM rằng DAI bù đắp cho sự vắng mặt của hạ tầng thể chế (Nhóm IV–V), thay vì chỉ khuếch đại lợi thế đã có tại Nhóm I. Tại Singapore (P4, DAI Tier-1+2), DAI phát huy rõ nhất dưới dạng amplification effect (</w:t>
+      </w:r>
+      <m:oMath>
+        <m:acc>
+          <m:accPr>
+            <m:chr m:val="̂"/>
+          </m:accPr>
+          <m:e>
+            <m:r>
+              <m:t>β</m:t>
+            </m:r>
+          </m:e>
+        </m:acc>
+        <m:d>
+          <m:dPr>
+            <m:begChr m:val="("/>
+            <m:endChr m:val=")"/>
+            <m:sepChr m:val=""/>
+            <m:grow/>
+          </m:dPr>
+          <m:e>
+            <m:sSup>
+              <m:e>
+                <m:r>
+                  <m:rPr>
+                    <m:nor/>
+                    <m:sty m:val="p"/>
+                  </m:rPr>
+                  <m:t>FSTS</m:t>
+                </m:r>
+              </m:e>
+              <m:sup>
+                <m:r>
+                  <m:t>2</m:t>
+                </m:r>
+              </m:sup>
+            </m:sSup>
+            <m:r>
+              <m:rPr>
+                <m:sty m:val="p"/>
+              </m:rPr>
+              <m:t>×</m:t>
+            </m:r>
+            <m:r>
+              <m:rPr>
+                <m:nor/>
+                <m:sty m:val="p"/>
+              </m:rPr>
+              <m:t>DAI</m:t>
+            </m:r>
+          </m:e>
+        </m:d>
+        <m:r>
+          <m:rPr>
+            <m:sty m:val="p"/>
+          </m:rPr>
+          <m:t>=</m:t>
+        </m:r>
+        <m:r>
+          <m:rPr>
+            <m:sty m:val="p"/>
+          </m:rPr>
+          <m:t>+</m:t>
+        </m:r>
+        <m:r>
+          <m:t>3</m:t>
+        </m:r>
+        <m:r>
+          <m:rPr>
+            <m:sty m:val="p"/>
+          </m:rPr>
+          <m:t>,</m:t>
+        </m:r>
+        <m:r>
+          <m:t>119</m:t>
+        </m:r>
+      </m:oMath>
+      <w:r>
+        <w:t xml:space="preserve">,</w:t>
+      </w:r>
+      <w:r>
+        <w:t xml:space="preserve"> </w:t>
+      </w:r>
+      <m:oMath>
+        <m:r>
+          <m:t>p</m:t>
+        </m:r>
+        <m:r>
+          <m:rPr>
+            <m:sty m:val="p"/>
+          </m:rPr>
+          <m:t>=</m:t>
+        </m:r>
+        <m:r>
+          <m:rPr>
+            <m:sty m:val="p"/>
+          </m:rPr>
+          <m:t>,</m:t>
+        </m:r>
+        <m:r>
+          <m:t>005</m:t>
+        </m:r>
+      </m:oMath>
+      <w:r>
+        <w:t xml:space="preserve">). Tại Việt Nam (P3, Tier-1 only, IV-estimated), DAI null phản ánh hạn chế đo lường và selection bias hơn là bác bỏ H3.</w:t>
       </w:r>
     </w:p>
     <w:p>
@@ -289,7 +747,7 @@
         <w:pStyle w:val="BodyText"/>
       </w:pPr>
       <w:r>
-        <w:t xml:space="preserve">Kết quả này hỗ trợ lập luận trong khung CDCM rằng DAI là</w:t>
+        <w:t xml:space="preserve">Kết quả tổng hợp hỗ trợ lập luận trong khung CDCM rằng DAI là</w:t>
       </w:r>
       <w:r>
         <w:t xml:space="preserve"> </w:t>
@@ -305,7 +763,23 @@
         <w:t xml:space="preserve"> </w:t>
       </w:r>
       <w:r>
-        <w:t xml:space="preserve">(situational resource) chứ không phải năng lực nền tảng: hiệu quả của nó phụ thuộc vào điều kiện môi trường (thể chế, cơ sở hạ tầng số) chứ không phải là hiệu ứng phổ quát. Đây là điểm phân biệt quan trọng giữa TCI và DAI trong đóng góp lý thuyết của luận án.</w:t>
+        <w:t xml:space="preserve">(situational resource) chứ không phải năng lực nền tảng: cơ chế cụ thể của nó (compression vs amplification) phụ thuộc vào điều kiện môi trường (thể chế, cơ sở hạ tầng số) — nhưng bản thân hiệu ứng DAI là</w:t>
+      </w:r>
+      <w:r>
+        <w:t xml:space="preserve"> </w:t>
+      </w:r>
+      <w:r>
+        <w:rPr>
+          <w:bCs/>
+          <w:b/>
+        </w:rPr>
+        <w:t xml:space="preserve">phổ quát</w:t>
+      </w:r>
+      <w:r>
+        <w:t xml:space="preserve"> </w:t>
+      </w:r>
+      <w:r>
+        <w:t xml:space="preserve">trên toàn mẫu đa bối cảnh. Đây là điểm phân biệt quan trọng giữa TCI và DAI trong đóng góp lý thuyết của luận án.</w:t>
       </w:r>
     </w:p>
     <w:p>
@@ -1983,7 +2457,7 @@
         <w:t xml:space="preserve"> </w:t>
       </w:r>
       <w:r>
-        <w:t xml:space="preserve">(bản thảo đang chuẩn bị, Đỗ &amp; Phan, 2026): kiểm định toàn mẫu châu Á</w:t>
+        <w:t xml:space="preserve">(bản thảo đang chuẩn bị, Đỗ &amp; Phan, 2026): kiểm định toàn mẫu châu Á và Thái Bình Dương</w:t>
       </w:r>
       <w:r>
         <w:t xml:space="preserve"> </w:t>
@@ -1999,11 +2473,102 @@
           <m:t>=</m:t>
         </m:r>
         <m:r>
-          <m:t>36.137</m:t>
+          <m:t>84.910</m:t>
         </m:r>
       </m:oMath>
       <w:r>
-        <w:t xml:space="preserve">, TP = 52,7%, gradient ICRV xác nhận, TCI dương và có ý nghĩa, DAI chỉ có ý nghĩa trong Advanced.</w:t>
+        <w:t xml:space="preserve"> </w:t>
+      </w:r>
+      <w:r>
+        <w:t xml:space="preserve">(M2) /</w:t>
+      </w:r>
+      <w:r>
+        <w:t xml:space="preserve"> </w:t>
+      </w:r>
+      <m:oMath>
+        <m:r>
+          <m:t>N</m:t>
+        </m:r>
+        <m:r>
+          <m:rPr>
+            <m:sty m:val="p"/>
+          </m:rPr>
+          <m:t>=</m:t>
+        </m:r>
+        <m:r>
+          <m:t>38.342</m:t>
+        </m:r>
+      </m:oMath>
+      <w:r>
+        <w:t xml:space="preserve"> </w:t>
+      </w:r>
+      <w:r>
+        <w:t xml:space="preserve">(M3–M5 với controls đầy đủ), TP = 36,4–40,0% (M2–M5; M11 đầy đủ: TP = 34,6%,</w:t>
+      </w:r>
+      <w:r>
+        <w:t xml:space="preserve"> </w:t>
+      </w:r>
+      <m:oMath>
+        <m:sSub>
+          <m:e>
+            <m:r>
+              <m:t>p</m:t>
+            </m:r>
+          </m:e>
+          <m:sub>
+            <m:r>
+              <m:rPr>
+                <m:nor/>
+                <m:sty m:val="p"/>
+              </m:rPr>
+              <m:t>LM</m:t>
+            </m:r>
+          </m:sub>
+        </m:sSub>
+        <m:r>
+          <m:rPr>
+            <m:sty m:val="p"/>
+          </m:rPr>
+          <m:t>=</m:t>
+        </m:r>
+        <m:r>
+          <m:rPr>
+            <m:sty m:val="p"/>
+          </m:rPr>
+          <m:t>,</m:t>
+        </m:r>
+        <m:r>
+          <m:t>002</m:t>
+        </m:r>
+      </m:oMath>
+      <w:r>
+        <w:t xml:space="preserve">), gradient ICRV xác nhận mạnh mẽ, TCI nâng mặt bằng năng suất phổ quát, DAI điều tiết đường cong có ý nghĩa trên toàn mẫu và mạnh hơn tại thể chế yếu hơn (DAI×ICRV</w:t>
+      </w:r>
+      <w:r>
+        <w:t xml:space="preserve"> </w:t>
+      </w:r>
+      <m:oMath>
+        <m:r>
+          <m:t>p</m:t>
+        </m:r>
+        <m:r>
+          <m:rPr>
+            <m:sty m:val="p"/>
+          </m:rPr>
+          <m:t>=</m:t>
+        </m:r>
+        <m:r>
+          <m:rPr>
+            <m:sty m:val="p"/>
+          </m:rPr>
+          <m:t>,</m:t>
+        </m:r>
+        <m:r>
+          <m:t>012</m:t>
+        </m:r>
+      </m:oMath>
+      <w:r>
+        <w:t xml:space="preserve">).</w:t>
       </w:r>
     </w:p>
     <w:p>
@@ -2155,7 +2720,7 @@
         <w:pStyle w:val="FirstParagraph"/>
       </w:pPr>
       <w:r>
-        <w:t xml:space="preserve">Bằng chứng từ 235 nghiên cứu và 36.137 doanh nghiệp ở 47 nền kinh tế châu Á và Thái Bình Dương đều chỉ đến kết luận này. Quan hệ I→P không phải là một đường cong phổ quát mà là một</w:t>
+        <w:t xml:space="preserve">Bằng chứng từ 235 nghiên cứu (P6 meta-analysis) và 84.910 doanh nghiệp tại 49 nền kinh tế châu Á và Thái Bình Dương (P7) đều chỉ đến kết luận này. Quan hệ I→P không phải là một đường cong phổ quát mà là một</w:t>
       </w:r>
       <w:r>
         <w:t xml:space="preserve"> </w:t>
@@ -2171,7 +2736,7 @@
         <w:t xml:space="preserve"> </w:t>
       </w:r>
       <w:r>
-        <w:t xml:space="preserve">(family of context-dependent curves), với turning point là hàm số tăng dần của chất lượng thể chế theo ICRV.</w:t>
+        <w:t xml:space="preserve">(family of context-dependent curves), với turning point là hàm số giảm dần của chất lượng thể chế theo ICRV — thể chế càng mạnh, turning point càng sớm (FSTS thấp hơn).</w:t>
       </w:r>
     </w:p>
     <w:bookmarkEnd w:id="45"/>

</xml_diff>

<commit_message>
build(dist): rebuild chuong_5 docx after DAI×ICRV corrections
Reflects corrected §5.1.3, §5.3.1 (DAI as digital shield stronger in
weak institutions) and §5.3.3 (ICRV gradient TP giảm from SIDS to Advanced).

https://claude.ai/code/session_01GMFmEtt6FYiJ4MKzBNCLqb
</commit_message>
<xml_diff>
--- a/dist/luan_an_ctu/chuong_5_ket_luan_de_xuat_vi.docx
+++ b/dist/luan_an_ctu/chuong_5_ket_luan_de_xuat_vi.docx
@@ -811,7 +811,23 @@
         <w:pStyle w:val="BodyText"/>
       </w:pPr>
       <w:r>
-        <w:t xml:space="preserve">Một giải thích bổ sung từ Institutional Theory: ở các bối cảnh ICRV thấp với nhiều "institutional voids" (Khanna &amp; Palepu, 2010), việc áp dụng công cụ số bề mặt không đủ để bù đắp cho sự thiếu hụt hạ tầng vật lý, hệ thống thanh toán và khung pháp lý thương mại điện tử. DAI chỉ phát huy "digital shield effect" khi nền tảng thể chế hỗ trợ đã có sẵn.</w:t>
+        <w:t xml:space="preserve">Một giải thích bổ sung từ Institutional Theory: ở các bối cảnh ICRV thấp với nhiều "institutional voids" (Khanna &amp; Palepu, 2010), các doanh nghiệp xuất khẩu phụ thuộc vào DAI nhiều hơn như một cơ chế bù đắp cho thiếu hụt hạ tầng thể chế. Bằng chứng: DAI×ICRV (p=.012) trong P7 cho thấy DAI</w:t>
+      </w:r>
+      <w:r>
+        <w:t xml:space="preserve"> </w:t>
+      </w:r>
+      <w:r>
+        <w:rPr>
+          <w:bCs/>
+          <w:b/>
+        </w:rPr>
+        <w:t xml:space="preserve">mạnh hơn</w:t>
+      </w:r>
+      <w:r>
+        <w:t xml:space="preserve"> </w:t>
+      </w:r>
+      <w:r>
+        <w:t xml:space="preserve">tại thể chế yếu — "digital shield effect" phát huy mạnh nhất khi nền tảng thể chế còn thiếu hụt, không phải khi thể chế đã hoàn thiện.</w:t>
       </w:r>
     </w:p>
     <w:bookmarkEnd w:id="23"/>
@@ -1459,7 +1475,23 @@
         <w:t xml:space="preserve"> </w:t>
       </w:r>
       <w:r>
-        <w:t xml:space="preserve">trong khung CDCM. Phát hiện rằng DAI chỉ phát huy vai trò điều tiết trong bối cảnh Advanced (Nhóm I, II) và không có ý nghĩa trong Frontier/SIDS gợi ý rằng DAI không phải là foundational capability (như TCI) mà là</w:t>
+        <w:t xml:space="preserve">trong khung CDCM. Phát hiện rằng DAI có hiệu ứng nâng mặt bằng phổ quát (β=+0.155, p&lt;.001, mẫu gộp N=84,910 từ 49 nền kinh tế) nhưng vai trò điều tiết đường cong I→P là</w:t>
+      </w:r>
+      <w:r>
+        <w:t xml:space="preserve"> </w:t>
+      </w:r>
+      <w:r>
+        <w:rPr>
+          <w:bCs/>
+          <w:b/>
+        </w:rPr>
+        <w:t xml:space="preserve">bối cảnh-phụ thuộc</w:t>
+      </w:r>
+      <w:r>
+        <w:t xml:space="preserve"> </w:t>
+      </w:r>
+      <w:r>
+        <w:t xml:space="preserve">(DAI×ICRV: p=.012) gợi ý rằng DAI không phải là foundational capability (như TCI) mà là</w:t>
       </w:r>
       <w:r>
         <w:t xml:space="preserve"> </w:t>
@@ -1475,7 +1507,23 @@
         <w:t xml:space="preserve"> </w:t>
       </w:r>
       <w:r>
-        <w:t xml:space="preserve">— tài nguyên có điều kiện phụ thuộc vào hệ sinh thái số xung quanh.</w:t>
+        <w:t xml:space="preserve">— tài nguyên có vai trò thay đổi theo bối cảnh thể chế. Quan trọng: DAI×ICRV (p=.012) cho thấy hiệu ứng điều tiết của DAI</w:t>
+      </w:r>
+      <w:r>
+        <w:t xml:space="preserve"> </w:t>
+      </w:r>
+      <w:r>
+        <w:rPr>
+          <w:bCs/>
+          <w:b/>
+        </w:rPr>
+        <w:t xml:space="preserve">mạnh hơn</w:t>
+      </w:r>
+      <w:r>
+        <w:t xml:space="preserve"> </w:t>
+      </w:r>
+      <w:r>
+        <w:t xml:space="preserve">tại các nền kinh tế thể chế yếu hơn (Frontier, SIDS) — "digital shield" bù đắp cho thiếu hụt thể chế.</w:t>
       </w:r>
     </w:p>
     <w:p>
@@ -1483,7 +1531,7 @@
         <w:pStyle w:val="BodyText"/>
       </w:pPr>
       <w:r>
-        <w:t xml:space="preserve">Điều này có hàm ý lý thuyết quan trọng cho RBV và digital capability literature (Bhandari et al., 2023; Verhoef et al., 2021): không phải mọi nguồn lực số đều tạo ra lợi thế cạnh tranh trong mọi bối cảnh. Giá trị của DAI là</w:t>
+        <w:t xml:space="preserve">Điều này có hàm ý lý thuyết quan trọng cho RBV và digital capability literature (Bhandari et al., 2023; Verhoef et al., 2021): không phải mọi nguồn lực số đều tạo ra lợi thế cạnh tranh theo cùng một cơ chế trong mọi bối cảnh. Giá trị của DAI là</w:t>
       </w:r>
       <w:r>
         <w:t xml:space="preserve"> </w:t>
@@ -1499,7 +1547,20 @@
         <w:t xml:space="preserve"> </w:t>
       </w:r>
       <w:r>
-        <w:t xml:space="preserve">(Teece, 1986) cần đi kèm với cơ sở hạ tầng thể chế và số phù hợp. Không có complementary assets, DAI chỉ là chi phí bổ sung mà không tạo ra lợi thế.</w:t>
+        <w:t xml:space="preserve">(Teece, 1986) với bối cảnh thể chế — nhưng theo hướng</w:t>
+      </w:r>
+      <w:r>
+        <w:t xml:space="preserve"> </w:t>
+      </w:r>
+      <w:r>
+        <w:rPr>
+          <w:bCs/>
+          <w:b/>
+        </w:rPr>
+        <w:t xml:space="preserve">nghịch chiều</w:t>
+      </w:r>
+      <w:r>
+        <w:t xml:space="preserve">: DAI hoạt động như lá chắn bù đắp (compensatory asset) trong bối cảnh thể chế yếu, nơi hạ tầng thể chế chưa đủ hỗ trợ cho doanh nghiệp xuất khẩu. Đây là bằng chứng thực nghiệm bổ sung cho lý thuyết về vai trò thay thế giữa thể chế và năng lực số.</w:t>
       </w:r>
     </w:p>
     <w:bookmarkEnd w:id="31"/>
@@ -1609,7 +1670,23 @@
         <w:t xml:space="preserve">dự đoán</w:t>
       </w:r>
       <w:r>
-        <w:t xml:space="preserve">: turning point I→P tăng đơn điệu theo chiều từ SIDS lên Advanced Innovation, xác nhận giá trị dự đoán của phân loại.</w:t>
+        <w:t xml:space="preserve">: turning point I→P</w:t>
+      </w:r>
+      <w:r>
+        <w:t xml:space="preserve"> </w:t>
+      </w:r>
+      <w:r>
+        <w:rPr>
+          <w:bCs/>
+          <w:b/>
+        </w:rPr>
+        <w:t xml:space="preserve">giảm</w:t>
+      </w:r>
+      <w:r>
+        <w:t xml:space="preserve"> </w:t>
+      </w:r>
+      <w:r>
+        <w:t xml:space="preserve">đơn điệu theo chiều từ SIDS/Frontier (~55%) xuống Advanced Innovation (~28%) — thể chế càng mạnh, doanh nghiệp đạt đỉnh hiệu quả ở mức quốc tế hóa thấp hơn — xác nhận giá trị dự đoán của phân loại.</w:t>
       </w:r>
     </w:p>
     <w:p>

</xml_diff>

<commit_message>
fix: two final stale facts in dist/chuong_5 §5.6.2 conclusion paragraph
- N: "36.137 doanh nghiệp" → "84.910–91.982 doanh nghiệp"
- economies: "47" → "47–49"
- ICRV gradient direction: "turning point là hàm số tăng dần của chất lượng
  thể chế" (WRONG — implies Advanced has higher TP) →
  "hàm số giảm dần … cao nhất ở Frontier/SIDS (~55%), thấp nhất ở
  Advanced Innovation (~28%)"
- chuong_5 docx rebuilt

https://claude.ai/code/session_01GMFmEtt6FYiJ4MKzBNCLqb
</commit_message>
<xml_diff>
--- a/dist/luan_an_ctu/chuong_5_ket_luan_de_xuat_vi.docx
+++ b/dist/luan_an_ctu/chuong_5_ket_luan_de_xuat_vi.docx
@@ -2687,7 +2687,7 @@
         <w:pStyle w:val="FirstParagraph"/>
       </w:pPr>
       <w:r>
-        <w:t xml:space="preserve">Bằng chứng từ 235 nghiên cứu và 36.137 doanh nghiệp ở 47 nền kinh tế châu Á và Thái Bình Dương đều chỉ đến kết luận này. Quan hệ I→P không phải là một đường cong phổ quát mà là một</w:t>
+        <w:t xml:space="preserve">Bằng chứng từ 235 nghiên cứu và 84.910–91.982 doanh nghiệp ở 47–49 nền kinh tế châu Á và Thái Bình Dương đều chỉ đến kết luận này. Quan hệ I→P không phải là một đường cong phổ quát mà là một</w:t>
       </w:r>
       <w:r>
         <w:t xml:space="preserve"> </w:t>
@@ -2703,7 +2703,23 @@
         <w:t xml:space="preserve"> </w:t>
       </w:r>
       <w:r>
-        <w:t xml:space="preserve">(family of context-dependent curves), với turning point là hàm số tăng dần của chất lượng thể chế theo ICRV.</w:t>
+        <w:t xml:space="preserve">(family of context-dependent curves), với turning point là hàm số</w:t>
+      </w:r>
+      <w:r>
+        <w:t xml:space="preserve"> </w:t>
+      </w:r>
+      <w:r>
+        <w:rPr>
+          <w:bCs/>
+          <w:b/>
+        </w:rPr>
+        <w:t xml:space="preserve">giảm dần</w:t>
+      </w:r>
+      <w:r>
+        <w:t xml:space="preserve"> </w:t>
+      </w:r>
+      <w:r>
+        <w:t xml:space="preserve">của chất lượng thể chế theo ICRV — cao nhất ở Frontier/SIDS (~55% FSTS), thấp nhất ở Advanced Innovation (~28% FSTS).</w:t>
       </w:r>
     </w:p>
     <w:bookmarkEnd w:id="45"/>

</xml_diff>

<commit_message>
fix: update P3/P4/P5 submission status in §5.6.1 summary lists
Replace stale "bản thảo đang chuẩn bị" with journal submission status
in three files (dist/chuong_5, thesis/chuong_5, thesis/04_05):
- P3 → JABS under review
- P4 → MIR under review
- P5 → IJOEM under review

Rebuild dist/chuong_5_ket_luan_de_xuat_vi.docx from updated source.
check-consistency.py: 0 issues.

https://claude.ai/code/session_01GMFmEtt6FYiJ4MKzBNCLqb
</commit_message>
<xml_diff>
--- a/dist/luan_an_ctu/chuong_5_ket_luan_de_xuat_vi.docx
+++ b/dist/luan_an_ctu/chuong_5_ket_luan_de_xuat_vi.docx
@@ -2,7 +2,7 @@
 <file path=word/document.xml><?xml version="1.0" encoding="utf-8"?>
 <w:document xmlns:w="http://schemas.openxmlformats.org/wordprocessingml/2006/main" xmlns:m="http://schemas.openxmlformats.org/officeDocument/2006/math" xmlns:r="http://schemas.openxmlformats.org/officeDocument/2006/relationships" xmlns:o="urn:schemas-microsoft-com:office:office" xmlns:v="urn:schemas-microsoft-com:vml" xmlns:w10="urn:schemas-microsoft-com:office:word" xmlns:a="http://schemas.openxmlformats.org/drawingml/2006/main" xmlns:pic="http://schemas.openxmlformats.org/drawingml/2006/picture" xmlns:wp="http://schemas.openxmlformats.org/drawingml/2006/wordprocessingDrawing">
   <w:body>
-    <w:bookmarkStart w:id="49" w:name="chương-5-kết-luận-và-đề-xuất"/>
+    <w:bookmarkStart w:id="20" w:name="chương-5-kết-luận-và-đề-xuất"/>
     <w:p>
       <w:pPr>
         <w:pStyle w:val="Heading1"/>
@@ -11,6 +11,7 @@
         <w:t xml:space="preserve">CHƯƠNG 5: KẾT LUẬN VÀ ĐỀ XUẤT</w:t>
       </w:r>
     </w:p>
+    <w:bookmarkEnd w:id="20"/>
     <w:p>
       <w:r>
         <w:pict>
@@ -18,7 +19,7 @@
         </w:pict>
       </w:r>
     </w:p>
-    <w:bookmarkStart w:id="20" w:name="giới-thiệu-chương"/>
+    <w:bookmarkStart w:id="21" w:name="giới-thiệu-chương"/>
     <w:p>
       <w:pPr>
         <w:pStyle w:val="Heading2"/>
@@ -42,8 +43,8 @@
         </w:pict>
       </w:r>
     </w:p>
-    <w:bookmarkEnd w:id="20"/>
-    <w:bookmarkStart w:id="26" w:name="Xa49aadb40c127a83ebe1d91ac222e3bdb8617c2"/>
+    <w:bookmarkEnd w:id="21"/>
+    <w:bookmarkStart w:id="27" w:name="Xff8cef3ed320f9cf6f3fba4ff558bfed3af19c6"/>
     <w:p>
       <w:pPr>
         <w:pStyle w:val="Heading2"/>
@@ -52,7 +53,7 @@
         <w:t xml:space="preserve">5.1 Bàn luận kết quả theo khung lý thuyết CDCM</w:t>
       </w:r>
     </w:p>
-    <w:bookmarkStart w:id="21" w:name="X751baa465f16b11eec18b61295bd32c9b23dafc"/>
+    <w:bookmarkStart w:id="22" w:name="X87949b622680195c8f5649c31ec800d0d4afb82"/>
     <w:p>
       <w:pPr>
         <w:pStyle w:val="Heading3"/>
@@ -248,8 +249,8 @@
         <w:t xml:space="preserve">: môi trường thể chế tốt cũng có nghĩa là hệ sinh thái dịch vụ hỗ trợ (logistics, tài chính thương mại, tư vấn pháp lý quốc tế) phát triển, làm giảm gánh nặng điều phối nội bộ của doanh nghiệp khi mở rộng quốc tế.</w:t>
       </w:r>
     </w:p>
-    <w:bookmarkEnd w:id="21"/>
-    <w:bookmarkStart w:id="22" w:name="X49fe7c9f8cdd3930e11cda3dd359bf7233b04b5"/>
+    <w:bookmarkEnd w:id="22"/>
+    <w:bookmarkStart w:id="23" w:name="tci-là-năng-lực-nền-tảng-xác-nhận-h2"/>
     <w:p>
       <w:pPr>
         <w:pStyle w:val="Heading3"/>
@@ -290,8 +291,8 @@
         <w:t xml:space="preserve">Cơ chế lý thuyết đằng sau kết quả này bắt nguồn từ Resource-Based View (Barney, 1991): TCI là nguồn lực VRIN (có giá trị, hiếm, khó sao chép, khó thay thế), do đó tạo ra lợi thế cạnh tranh bền vững ngay cả khi doanh nghiệp mở rộng ra thị trường nước ngoài với mức độ bất định cao. Năng lực công nghệ cũng tạo ra absorptive capacity (Cohen &amp; Levinthal, 1990) — khả năng hấp thu và tích hợp tri thức từ thị trường nước ngoài — giúp doanh nghiệp học hỏi hiệu quả hơn trong quá trình quốc tế hóa, nhất quán với learning loop của Uppsala model (Johanson &amp; Vahlne, 1977).</w:t>
       </w:r>
     </w:p>
-    <w:bookmarkEnd w:id="22"/>
-    <w:bookmarkStart w:id="23" w:name="Xa91918a719079ebfa81edd5c575587c3bf67faa"/>
+    <w:bookmarkEnd w:id="23"/>
+    <w:bookmarkStart w:id="24" w:name="X27755afda27725d75d6cee82c01fb99e8279a05"/>
     <w:p>
       <w:pPr>
         <w:pStyle w:val="Heading3"/>
@@ -747,7 +748,25 @@
         <w:t xml:space="preserve"> </w:t>
       </w:r>
       <w:r>
-        <w:t xml:space="preserve">(static digital adoption index) dựa trên dữ liệu WBES tại một thời điểm — không phải "dynamic digital capability" theo nghĩa của dynamic capabilities theory (Teece et al., 1997) vì dữ liệu WBES không có đủ thang đo để đo lường tính động của năng lực số.</w:t>
+        <w:t xml:space="preserve">(static digital adoption index) dựa trên dữ liệu WBES tại một thời điểm — không phải</w:t>
+      </w:r>
+      <w:r>
+        <w:t xml:space="preserve"> </w:t>
+      </w:r>
+      <w:r>
+        <w:t xml:space="preserve">“</w:t>
+      </w:r>
+      <w:r>
+        <w:t xml:space="preserve">dynamic digital capability</w:t>
+      </w:r>
+      <w:r>
+        <w:t xml:space="preserve">”</w:t>
+      </w:r>
+      <w:r>
+        <w:t xml:space="preserve"> </w:t>
+      </w:r>
+      <w:r>
+        <w:t xml:space="preserve">theo nghĩa của dynamic capabilities theory (Teece et al., 1997) vì dữ liệu WBES không có đủ thang đo để đo lường tính động của năng lực số.</w:t>
       </w:r>
     </w:p>
     <w:p>
@@ -755,7 +774,25 @@
         <w:pStyle w:val="BodyText"/>
       </w:pPr>
       <w:r>
-        <w:t xml:space="preserve">Một giải thích bổ sung từ Institutional Theory: ở các bối cảnh ICRV thấp với nhiều "institutional voids" (Khanna &amp; Palepu, 2010), việc áp dụng công cụ số bề mặt không đủ để bù đắp cho sự thiếu hụt hạ tầng vật lý, hệ thống thanh toán và khung pháp lý thương mại điện tử. Kết quả DAI×ICRV (</w:t>
+        <w:t xml:space="preserve">Một giải thích bổ sung từ Institutional Theory: ở các bối cảnh ICRV thấp với nhiều</w:t>
+      </w:r>
+      <w:r>
+        <w:t xml:space="preserve"> </w:t>
+      </w:r>
+      <w:r>
+        <w:t xml:space="preserve">“</w:t>
+      </w:r>
+      <w:r>
+        <w:t xml:space="preserve">institutional voids</w:t>
+      </w:r>
+      <w:r>
+        <w:t xml:space="preserve">”</w:t>
+      </w:r>
+      <w:r>
+        <w:t xml:space="preserve"> </w:t>
+      </w:r>
+      <w:r>
+        <w:t xml:space="preserve">(Khanna &amp; Palepu, 2010), việc áp dụng công cụ số bề mặt không đủ để bù đắp cho sự thiếu hụt hạ tầng vật lý, hệ thống thanh toán và khung pháp lý thương mại điện tử. Kết quả DAI×ICRV (</w:t>
       </w:r>
       <m:oMath>
         <m:r>
@@ -794,11 +831,44 @@
         <w:t xml:space="preserve"> </w:t>
       </w:r>
       <w:r>
-        <w:t xml:space="preserve">tại các bối cảnh thể chế yếu hơn — "digital shield effect" phát huy mạnh nhất khi nền tảng thể chế còn thiếu hụt, bù đắp cho các "institutional voids".</w:t>
-      </w:r>
-    </w:p>
-    <w:bookmarkEnd w:id="23"/>
-    <w:bookmarkStart w:id="24" w:name="Xa50feea436358d6c79850f8e0ee4f310f84827b"/>
+        <w:t xml:space="preserve">tại các bối cảnh thể chế yếu hơn —</w:t>
+      </w:r>
+      <w:r>
+        <w:t xml:space="preserve"> </w:t>
+      </w:r>
+      <w:r>
+        <w:t xml:space="preserve">“</w:t>
+      </w:r>
+      <w:r>
+        <w:t xml:space="preserve">digital shield effect</w:t>
+      </w:r>
+      <w:r>
+        <w:t xml:space="preserve">”</w:t>
+      </w:r>
+      <w:r>
+        <w:t xml:space="preserve"> </w:t>
+      </w:r>
+      <w:r>
+        <w:t xml:space="preserve">phát huy mạnh nhất khi nền tảng thể chế còn thiếu hụt, bù đắp cho các</w:t>
+      </w:r>
+      <w:r>
+        <w:t xml:space="preserve"> </w:t>
+      </w:r>
+      <w:r>
+        <w:t xml:space="preserve">“</w:t>
+      </w:r>
+      <w:r>
+        <w:t xml:space="preserve">institutional voids</w:t>
+      </w:r>
+      <w:r>
+        <w:t xml:space="preserve">”</w:t>
+      </w:r>
+      <w:r>
+        <w:t xml:space="preserve">.</w:t>
+      </w:r>
+    </w:p>
+    <w:bookmarkEnd w:id="24"/>
+    <w:bookmarkStart w:id="25" w:name="X9c0cd9664cda47af8ea782aa1697b3fd1384e63"/>
     <w:p>
       <w:pPr>
         <w:pStyle w:val="Heading3"/>
@@ -941,11 +1011,11 @@
         <w:t xml:space="preserve"> </w:t>
       </w:r>
       <w:r>
-        <w:t xml:space="preserve">kinh nghiệm quốc tế (breadth vs. depth) — một hạn chế đo lường trong WBES cần được khắc phục trong nghiên cứu tương lai.</w:t>
-      </w:r>
-    </w:p>
-    <w:bookmarkEnd w:id="24"/>
-    <w:bookmarkStart w:id="25" w:name="X965f3e2835fec9004e9a3f92ee374aa0d8e2a7a"/>
+        <w:t xml:space="preserve">kinh nghiệm quốc tế (breadth vs. depth) — một hạn chế đo lường trong WBES cần được khắc phục trong nghiên cứu tương lai.</w:t>
+      </w:r>
+    </w:p>
+    <w:bookmarkEnd w:id="25"/>
+    <w:bookmarkStart w:id="26" w:name="Xfdc4f05762204c1e9501761a1ebcb843f9171c3"/>
     <w:p>
       <w:pPr>
         <w:pStyle w:val="Heading3"/>
@@ -1051,9 +1121,9 @@
         </w:pict>
       </w:r>
     </w:p>
-    <w:bookmarkEnd w:id="25"/>
     <w:bookmarkEnd w:id="26"/>
-    <w:bookmarkStart w:id="30" w:name="X03371f9bf2ea7aa70b56c3fc263517b182b20aa"/>
+    <w:bookmarkEnd w:id="27"/>
+    <w:bookmarkStart w:id="31" w:name="so-sánh-với-nghiên-cứu-trước-đây"/>
     <w:p>
       <w:pPr>
         <w:pStyle w:val="Heading2"/>
@@ -1062,7 +1132,7 @@
         <w:t xml:space="preserve">5.2 So sánh với nghiên cứu trước đây</w:t>
       </w:r>
     </w:p>
-    <w:bookmarkStart w:id="27" w:name="X6d63d205c02653fac9abe4b7c3c003ccf604ac6"/>
+    <w:bookmarkStart w:id="28" w:name="nhất-quán-với-baseline-icbef-2024"/>
     <w:p>
       <w:pPr>
         <w:pStyle w:val="Heading3"/>
@@ -1268,14 +1338,14 @@
         <w:t xml:space="preserve">, không phải sự bất đồng căn bản giữa các nghiên cứu.</w:t>
       </w:r>
     </w:p>
-    <w:bookmarkEnd w:id="27"/>
-    <w:bookmarkStart w:id="28" w:name="X3dc86f682c3e5e98bd0a470c7f8482e8e79f6fb"/>
+    <w:bookmarkEnd w:id="28"/>
+    <w:bookmarkStart w:id="29" w:name="X7b8db85450aaa41ba255e0d181ebc5c5ae65c48"/>
     <w:p>
       <w:pPr>
         <w:pStyle w:val="Heading3"/>
       </w:pPr>
       <w:r>
-        <w:t xml:space="preserve">5.2.2 Vượt qua Lu và Beamish (2004) và Contractor et al. (2003)</w:t>
+        <w:t xml:space="preserve">5.2.2 Vượt qua Lu và Beamish (2004) và Contractor et al. (2003)</w:t>
       </w:r>
     </w:p>
     <w:p>
@@ -1283,7 +1353,7 @@
         <w:pStyle w:val="FirstParagraph"/>
       </w:pPr>
       <w:r>
-        <w:t xml:space="preserve">Lu và Beamish (2004) và Contractor et al. (2003) là hai công trình nền tảng về quan hệ phi tuyến I→P. Lu và Beamish (2004) tìm turning point khoảng 60% FSTS trong mẫu doanh nghiệp Nhật Bản, trong khi Contractor et al. (2003) đề xuất S-curve ba giai đoạn. Luận án này vượt qua hai công trình đó theo ba hướng:</w:t>
+        <w:t xml:space="preserve">Lu và Beamish (2004) và Contractor et al. (2003) là hai công trình nền tảng về quan hệ phi tuyến I→P. Lu và Beamish (2004) tìm turning point khoảng 60% FSTS trong mẫu doanh nghiệp Nhật Bản, trong khi Contractor et al. (2003) đề xuất S-curve ba giai đoạn. Luận án này vượt qua hai công trình đó theo ba hướng:</w:t>
       </w:r>
     </w:p>
     <w:p>
@@ -1347,14 +1417,14 @@
         <w:t xml:space="preserve">, luận án mở rộng khung phân tích từ dữ liệu doanh nghiệp Nhật Bản/đa quốc gia sang 47 nền kinh tế châu Á và Thái Bình Dương — bối cảnh underrepresented trong literature Lu và Beamish.</w:t>
       </w:r>
     </w:p>
-    <w:bookmarkEnd w:id="28"/>
-    <w:bookmarkStart w:id="29" w:name="X0883d912591c701a2f1b2fed71cedb09e738376"/>
+    <w:bookmarkEnd w:id="29"/>
+    <w:bookmarkStart w:id="30" w:name="X7d417abcca377c053c807a61872538ebbcf35bb"/>
     <w:p>
       <w:pPr>
         <w:pStyle w:val="Heading3"/>
       </w:pPr>
       <w:r>
-        <w:t xml:space="preserve">5.2.3 Mở rộng Marano et al. (2016) — ICRV thay thế binary institutional quality</w:t>
+        <w:t xml:space="preserve">5.2.3 Mở rộng Marano et al. (2016) — ICRV thay thế binary institutional quality</w:t>
       </w:r>
     </w:p>
     <w:p>
@@ -1362,7 +1432,7 @@
         <w:pStyle w:val="FirstParagraph"/>
       </w:pPr>
       <w:r>
-        <w:t xml:space="preserve">Marano et al. (2016) là meta-analysis quan trọng nhất trong literature gần đây, cung cấp bằng chứng về vai trò điều tiết của home country institutions trong I→P relationship. Tuy nhiên, Marano et al. sử dụng phân loại binary (developed vs. emerging) hoặc continuous institutional quality scores.</w:t>
+        <w:t xml:space="preserve">Marano et al. (2016) là meta-analysis quan trọng nhất trong literature gần đây, cung cấp bằng chứng về vai trò điều tiết của home country institutions trong I→P relationship. Tuy nhiên, Marano et al. sử dụng phân loại binary (developed vs. emerging) hoặc continuous institutional quality scores.</w:t>
       </w:r>
     </w:p>
     <w:p>
@@ -1370,7 +1440,7 @@
         <w:pStyle w:val="BodyText"/>
       </w:pPr>
       <w:r>
-        <w:t xml:space="preserve">Luận án này mở rộng Marano et al. (2016) theo hướng</w:t>
+        <w:t xml:space="preserve">Luận án này mở rộng Marano et al. (2016) theo hướng</w:t>
       </w:r>
       <w:r>
         <w:t xml:space="preserve"> </w:t>
@@ -1383,7 +1453,43 @@
         <w:t xml:space="preserve">phân loại đa chiều</w:t>
       </w:r>
       <w:r>
-        <w:t xml:space="preserve">: ICRV sáu sub-regime nắm bắt được sự đa dạng trong nội bộ nhóm "emerging" (phân biệt Upper-middle Trung Quốc với Lower-mid Việt Nam với Frontier Bangladesh và SIDS) và nhóm "advanced" (phân biệt Advanced Innovation Singapore với Advanced Resource GCC). Phân loại nhị phân bỏ sót sự biến thiên quan trọng này, dẫn đến mất thông tin về gradient.</w:t>
+        <w:t xml:space="preserve">: ICRV sáu sub-regime nắm bắt được sự đa dạng trong nội bộ nhóm</w:t>
+      </w:r>
+      <w:r>
+        <w:t xml:space="preserve"> </w:t>
+      </w:r>
+      <w:r>
+        <w:t xml:space="preserve">“</w:t>
+      </w:r>
+      <w:r>
+        <w:t xml:space="preserve">emerging</w:t>
+      </w:r>
+      <w:r>
+        <w:t xml:space="preserve">”</w:t>
+      </w:r>
+      <w:r>
+        <w:t xml:space="preserve"> </w:t>
+      </w:r>
+      <w:r>
+        <w:t xml:space="preserve">(phân biệt Upper-middle Trung Quốc với Lower-mid Việt Nam với Frontier Bangladesh và SIDS) và nhóm</w:t>
+      </w:r>
+      <w:r>
+        <w:t xml:space="preserve"> </w:t>
+      </w:r>
+      <w:r>
+        <w:t xml:space="preserve">“</w:t>
+      </w:r>
+      <w:r>
+        <w:t xml:space="preserve">advanced</w:t>
+      </w:r>
+      <w:r>
+        <w:t xml:space="preserve">”</w:t>
+      </w:r>
+      <w:r>
+        <w:t xml:space="preserve"> </w:t>
+      </w:r>
+      <w:r>
+        <w:t xml:space="preserve">(phân biệt Advanced Innovation Singapore với Advanced Resource GCC). Phân loại nhị phân bỏ sót sự biến thiên quan trọng này, dẫn đến mất thông tin về gradient.</w:t>
       </w:r>
     </w:p>
     <w:p>
@@ -1391,7 +1497,7 @@
         <w:pStyle w:val="BodyText"/>
       </w:pPr>
       <w:r>
-        <w:t xml:space="preserve">Ngoài ra, luận án sử dụng phương pháp MARA ba tầng để phân tách cấu trúc dị biệt — một cải tiến phương pháp so với random-effects meta-analysis đơn tầng của Marano et al. (2016).</w:t>
+        <w:t xml:space="preserve">Ngoài ra, luận án sử dụng phương pháp MARA ba tầng để phân tách cấu trúc dị biệt — một cải tiến phương pháp so với random-effects meta-analysis đơn tầng của Marano et al. (2016).</w:t>
       </w:r>
     </w:p>
     <w:p>
@@ -1401,9 +1507,9 @@
         </w:pict>
       </w:r>
     </w:p>
-    <w:bookmarkEnd w:id="29"/>
     <w:bookmarkEnd w:id="30"/>
-    <w:bookmarkStart w:id="34" w:name="X358b70cb0587073926db05a46d0ec729e84bb90"/>
+    <w:bookmarkEnd w:id="31"/>
+    <w:bookmarkStart w:id="35" w:name="đóng-góp-lý-thuyết"/>
     <w:p>
       <w:pPr>
         <w:pStyle w:val="Heading2"/>
@@ -1412,7 +1518,7 @@
         <w:t xml:space="preserve">5.3 Đóng góp lý thuyết</w:t>
       </w:r>
     </w:p>
-    <w:bookmarkStart w:id="31" w:name="Xc6feaeb12e2f91980ada0175fe76f51b8cabb3c"/>
+    <w:bookmarkStart w:id="32" w:name="cdcm-làm-rõ-dai-là-nguồn-lực-tình-huống"/>
     <w:p>
       <w:pPr>
         <w:pStyle w:val="Heading3"/>
@@ -1490,7 +1596,25 @@
         <w:t xml:space="preserve"> </w:t>
       </w:r>
       <w:r>
-        <w:t xml:space="preserve">tại các nền kinh tế thể chế yếu hơn (Frontier, SIDS) — "digital shield" bù đắp cho thiếu hụt thể chế.</w:t>
+        <w:t xml:space="preserve">tại các nền kinh tế thể chế yếu hơn (Frontier, SIDS) —</w:t>
+      </w:r>
+      <w:r>
+        <w:t xml:space="preserve"> </w:t>
+      </w:r>
+      <w:r>
+        <w:t xml:space="preserve">“</w:t>
+      </w:r>
+      <w:r>
+        <w:t xml:space="preserve">digital shield</w:t>
+      </w:r>
+      <w:r>
+        <w:t xml:space="preserve">”</w:t>
+      </w:r>
+      <w:r>
+        <w:t xml:space="preserve"> </w:t>
+      </w:r>
+      <w:r>
+        <w:t xml:space="preserve">bù đắp cho thiếu hụt thể chế.</w:t>
       </w:r>
     </w:p>
     <w:p>
@@ -1517,8 +1641,8 @@
         <w:t xml:space="preserve">— tác động mạnh nhất khi thể chế không đủ để hỗ trợ quốc tế hóa, không phải chỉ khi hệ sinh thái số đã trưởng thành.</w:t>
       </w:r>
     </w:p>
-    <w:bookmarkEnd w:id="31"/>
-    <w:bookmarkStart w:id="32" w:name="X792bf669d8aaad9c154022edb47ba6166013782"/>
+    <w:bookmarkEnd w:id="32"/>
+    <w:bookmarkStart w:id="33" w:name="X2d492fa0307aa4991837f2d5dc38e247101178c"/>
     <w:p>
       <w:pPr>
         <w:pStyle w:val="Heading3"/>
@@ -1548,7 +1672,25 @@
         <w:t xml:space="preserve"> </w:t>
       </w:r>
       <w:r>
-        <w:t xml:space="preserve">— một construct lý thuyết mới chưa được định danh trong literature kinh doanh quốc tế — như một hiện tượng lý thuyết độc lập, khác biệt về bản chất với "phase 1 downward slope" trong S-curve theory. FIP không phải là giai đoạn đầu của quá trình học hỏi (learning costs) như mô hình Uppsala dự đoán, mà là một trạng thái cấu trúc bất lợi dài hạn: doanh nghiệp SIDS phải xuất khẩu để tồn tại (do thị trường nội địa quá nhỏ) nhưng không có năng lực và môi trường để đạt lợi thế từ xuất khẩu.</w:t>
+        <w:t xml:space="preserve">— một construct lý thuyết mới chưa được định danh trong literature kinh doanh quốc tế — như một hiện tượng lý thuyết độc lập, khác biệt về bản chất với</w:t>
+      </w:r>
+      <w:r>
+        <w:t xml:space="preserve"> </w:t>
+      </w:r>
+      <w:r>
+        <w:t xml:space="preserve">“</w:t>
+      </w:r>
+      <w:r>
+        <w:t xml:space="preserve">phase 1 downward slope</w:t>
+      </w:r>
+      <w:r>
+        <w:t xml:space="preserve">”</w:t>
+      </w:r>
+      <w:r>
+        <w:t xml:space="preserve"> </w:t>
+      </w:r>
+      <w:r>
+        <w:t xml:space="preserve">trong S-curve theory. FIP không phải là giai đoạn đầu của quá trình học hỏi (learning costs) như mô hình Uppsala dự đoán, mà là một trạng thái cấu trúc bất lợi dài hạn: doanh nghiệp SIDS phải xuất khẩu để tồn tại (do thị trường nội địa quá nhỏ) nhưng không có năng lực và môi trường để đạt lợi thế từ xuất khẩu.</w:t>
       </w:r>
     </w:p>
     <w:p>
@@ -1569,11 +1711,62 @@
         <w:t xml:space="preserve">điều kiện biên của lý thuyết quốc tế hóa</w:t>
       </w:r>
       <w:r>
-        <w:t xml:space="preserve">: trong điều kiện nào thì "more internationalization" luôn là "worse performance"? Luận án đề xuất rằng FIP xuất hiện khi ba điều kiện đồng thời: (i) thể chế ICRV ở mức thấp nhất, (ii) quy mô nền kinh tế quá nhỏ để tạo cơ sở nội địa, và (iii) thiếu hỗ trợ năng lực xuất khẩu từ chính sách. Kết hợp ba điều kiện này tạo ra "trap" — bẫy quốc tế hóa bắt buộc — mà không có turning point để thoát khỏi.</w:t>
-      </w:r>
-    </w:p>
-    <w:bookmarkEnd w:id="32"/>
-    <w:bookmarkStart w:id="33" w:name="Xc949420910752534bec0d1fee728c7a813a2f68"/>
+        <w:t xml:space="preserve">: trong điều kiện nào thì</w:t>
+      </w:r>
+      <w:r>
+        <w:t xml:space="preserve"> </w:t>
+      </w:r>
+      <w:r>
+        <w:t xml:space="preserve">“</w:t>
+      </w:r>
+      <w:r>
+        <w:t xml:space="preserve">more internationalization</w:t>
+      </w:r>
+      <w:r>
+        <w:t xml:space="preserve">”</w:t>
+      </w:r>
+      <w:r>
+        <w:t xml:space="preserve"> </w:t>
+      </w:r>
+      <w:r>
+        <w:t xml:space="preserve">luôn là</w:t>
+      </w:r>
+      <w:r>
+        <w:t xml:space="preserve"> </w:t>
+      </w:r>
+      <w:r>
+        <w:t xml:space="preserve">“</w:t>
+      </w:r>
+      <w:r>
+        <w:t xml:space="preserve">worse performance</w:t>
+      </w:r>
+      <w:r>
+        <w:t xml:space="preserve">”</w:t>
+      </w:r>
+      <w:r>
+        <w:t xml:space="preserve">? Luận án đề xuất rằng FIP xuất hiện khi ba điều kiện đồng thời: (i) thể chế ICRV ở mức thấp nhất, (ii) quy mô nền kinh tế quá nhỏ để tạo cơ sở nội địa, và (iii) thiếu hỗ trợ năng lực xuất khẩu từ chính sách. Kết hợp ba điều kiện này tạo ra</w:t>
+      </w:r>
+      <w:r>
+        <w:t xml:space="preserve"> </w:t>
+      </w:r>
+      <w:r>
+        <w:t xml:space="preserve">“</w:t>
+      </w:r>
+      <w:r>
+        <w:t xml:space="preserve">trap</w:t>
+      </w:r>
+      <w:r>
+        <w:t xml:space="preserve">”</w:t>
+      </w:r>
+      <w:r>
+        <w:t xml:space="preserve"> </w:t>
+      </w:r>
+      <w:r>
+        <w:t xml:space="preserve">— bẫy quốc tế hóa bắt buộc — mà không có turning point để thoát khỏi.</w:t>
+      </w:r>
+    </w:p>
+    <w:bookmarkEnd w:id="33"/>
+    <w:bookmarkStart w:id="34" w:name="Xc32e0c91761841c5d26867e9ff33e10da8db64c"/>
     <w:p>
       <w:pPr>
         <w:pStyle w:val="Heading3"/>
@@ -1650,9 +1843,9 @@
         </w:pict>
       </w:r>
     </w:p>
-    <w:bookmarkEnd w:id="33"/>
     <w:bookmarkEnd w:id="34"/>
-    <w:bookmarkStart w:id="38" w:name="X4f070f4201e8508645625eda6493d60cd486f27"/>
+    <w:bookmarkEnd w:id="35"/>
+    <w:bookmarkStart w:id="39" w:name="đề-xuất-chính-sách-và-quản-trị"/>
     <w:p>
       <w:pPr>
         <w:pStyle w:val="Heading2"/>
@@ -1661,7 +1854,7 @@
         <w:t xml:space="preserve">5.4 Đề xuất chính sách và quản trị</w:t>
       </w:r>
     </w:p>
-    <w:bookmarkStart w:id="35" w:name="X7cdaf271f3298cb573246cb59bc34e92c91d24d"/>
+    <w:bookmarkStart w:id="36" w:name="Xbc6d621fc32e0aca77269dff0917fe138aa2fc5"/>
     <w:p>
       <w:pPr>
         <w:pStyle w:val="Heading3"/>
@@ -1726,8 +1919,8 @@
         <w:t xml:space="preserve">Đối với Việt Nam cụ thể: turning point dịch chuyển từ 46,2% (2009) xuống 39,3% (2015) là tín hiệu đáng lo ngại. Nếu turning point tiếp tục dịch trái, điều đó hàm ý rằng lợi ích từ xuất khẩu đạt đỉnh sớm hơn và suy giảm nhanh hơn — có thể do cấu trúc xuất khẩu tập trung vào gia công với biên lợi nhuận mỏng. Chính sách nâng cao giá trị gia tăng trong xuất khẩu (moving up the value chain) kết hợp với tăng cường TCI có thể giúp đảo ngược xu hướng này.</w:t>
       </w:r>
     </w:p>
-    <w:bookmarkEnd w:id="35"/>
-    <w:bookmarkStart w:id="36" w:name="Xbb0ebb3f10e960b7d926ccd5aa748ccdb7740d7"/>
+    <w:bookmarkEnd w:id="36"/>
+    <w:bookmarkStart w:id="37" w:name="Xb72945ffcd7baeba99eebb1118ccccd8ec07fb7"/>
     <w:p>
       <w:pPr>
         <w:pStyle w:val="Heading3"/>
@@ -1848,8 +2041,8 @@
         <w:t xml:space="preserve">: kết quả FIP là cảnh báo nghiêm túc — đẩy mạnh xuất khẩu trong bối cảnh thiếu năng lực và hỗ trợ thể chế không cải thiện mà còn có thể làm xấu đi hiệu quả hoạt động. Doanh nghiệp SIDS nên ưu tiên xây dựng năng lực nội địa và nâng cao TCI trước khi mở rộng xuất khẩu đáng kể.</w:t>
       </w:r>
     </w:p>
-    <w:bookmarkEnd w:id="36"/>
-    <w:bookmarkStart w:id="37" w:name="X383f9bda7308bcecdf3fd26297745377ea89ee1"/>
+    <w:bookmarkEnd w:id="37"/>
+    <w:bookmarkStart w:id="38" w:name="X3f7c356bbecb0845bc3ba35928bc46323a69176"/>
     <w:p>
       <w:pPr>
         <w:pStyle w:val="Heading3"/>
@@ -1884,7 +2077,25 @@
         <w:t xml:space="preserve">không phải xuất khẩu nhiều hơn, mà phải xuất khẩu tốt hơn</w:t>
       </w:r>
       <w:r>
-        <w:t xml:space="preserve">. Cụ thể, ưu tiên nên là: (i) xây dựng hạ tầng logistics và kết nối (giảm chi phí cố định của xuất khẩu); (ii) phát triển năng lực doanh nghiệp thông qua TCI (chứ không chỉ DAI bề mặt); (iii) thiết kế chương trình hỗ trợ xuất khẩu có chọn lọc tập trung vào doanh nghiệp đã có đủ năng lực để hưởng lợi, thay vì khuyến khích đại trà. Nói tóm lại, tránh "bẫy quốc tế hóa bắt buộc" bằng cách đảm bảo rằng các can thiệp chính sách xây dựng năng lực trước khi thúc đẩy mở rộng thị trường.</w:t>
+        <w:t xml:space="preserve">. Cụ thể, ưu tiên nên là: (i) xây dựng hạ tầng logistics và kết nối (giảm chi phí cố định của xuất khẩu); (ii) phát triển năng lực doanh nghiệp thông qua TCI (chứ không chỉ DAI bề mặt); (iii) thiết kế chương trình hỗ trợ xuất khẩu có chọn lọc tập trung vào doanh nghiệp đã có đủ năng lực để hưởng lợi, thay vì khuyến khích đại trà. Nói tóm lại, tránh</w:t>
+      </w:r>
+      <w:r>
+        <w:t xml:space="preserve"> </w:t>
+      </w:r>
+      <w:r>
+        <w:t xml:space="preserve">“</w:t>
+      </w:r>
+      <w:r>
+        <w:t xml:space="preserve">bẫy quốc tế hóa bắt buộc</w:t>
+      </w:r>
+      <w:r>
+        <w:t xml:space="preserve">”</w:t>
+      </w:r>
+      <w:r>
+        <w:t xml:space="preserve"> </w:t>
+      </w:r>
+      <w:r>
+        <w:t xml:space="preserve">bằng cách đảm bảo rằng các can thiệp chính sách xây dựng năng lực trước khi thúc đẩy mở rộng thị trường.</w:t>
       </w:r>
     </w:p>
     <w:p>
@@ -1894,9 +2105,9 @@
         </w:pict>
       </w:r>
     </w:p>
-    <w:bookmarkEnd w:id="37"/>
     <w:bookmarkEnd w:id="38"/>
-    <w:bookmarkStart w:id="43" w:name="Xf80a1234b44a7d4089382a2631c25010c604edb"/>
+    <w:bookmarkEnd w:id="39"/>
+    <w:bookmarkStart w:id="44" w:name="hạn-chế-và-hướng-nghiên-cứu-tương-lai"/>
     <w:p>
       <w:pPr>
         <w:pStyle w:val="Heading2"/>
@@ -1905,7 +2116,7 @@
         <w:t xml:space="preserve">5.5 Hạn chế và hướng nghiên cứu tương lai</w:t>
       </w:r>
     </w:p>
-    <w:bookmarkStart w:id="39" w:name="Xfc21172891b143a859fa6a4cd4308b059abf57d"/>
+    <w:bookmarkStart w:id="40" w:name="hạn-chế-về-đo-lường-dai"/>
     <w:p>
       <w:pPr>
         <w:pStyle w:val="Heading3"/>
@@ -1943,11 +2154,29 @@
         <w:t xml:space="preserve"> </w:t>
       </w:r>
       <w:r>
-        <w:t xml:space="preserve">(tại một thời điểm khảo sát), không thể nắm bắt tính "dynamic" của việc cập nhật và tái cấu hình năng lực số theo thời gian. Điều này có nghĩa là các phát hiện về DAI trong luận án phản ánh mức độ chấp nhận số tại một thời điểm chứ không phải năng lực số năng động theo nghĩa của dynamic capabilities theory (Teece et al., 1997).</w:t>
-      </w:r>
-    </w:p>
-    <w:bookmarkEnd w:id="39"/>
-    <w:bookmarkStart w:id="40" w:name="X87e10c044c34a8346bd2a0229fbb014435526bd"/>
+        <w:t xml:space="preserve">(tại một thời điểm khảo sát), không thể nắm bắt tính</w:t>
+      </w:r>
+      <w:r>
+        <w:t xml:space="preserve"> </w:t>
+      </w:r>
+      <w:r>
+        <w:t xml:space="preserve">“</w:t>
+      </w:r>
+      <w:r>
+        <w:t xml:space="preserve">dynamic</w:t>
+      </w:r>
+      <w:r>
+        <w:t xml:space="preserve">”</w:t>
+      </w:r>
+      <w:r>
+        <w:t xml:space="preserve"> </w:t>
+      </w:r>
+      <w:r>
+        <w:t xml:space="preserve">của việc cập nhật và tái cấu hình năng lực số theo thời gian. Điều này có nghĩa là các phát hiện về DAI trong luận án phản ánh mức độ chấp nhận số tại một thời điểm chứ không phải năng lực số năng động theo nghĩa của dynamic capabilities theory (Teece et al., 1997).</w:t>
+      </w:r>
+    </w:p>
+    <w:bookmarkEnd w:id="40"/>
+    <w:bookmarkStart w:id="41" w:name="X0fb0169567c230dc5c1d35515099b26124d99e1"/>
     <w:p>
       <w:pPr>
         <w:pStyle w:val="Heading3"/>
@@ -1972,8 +2201,8 @@
         <w:t xml:space="preserve">Phân tích Heckman two-step (hoặc treatment effects models) trong các nghiên cứu tương lai có thể khắc phục phần nào hạn chế này bằng cách mô hình hóa quá trình lựa chọn tham gia xuất khẩu như giai đoạn thứ nhất trước khi ước lượng hiệu quả trong giai đoạn thứ hai.</w:t>
       </w:r>
     </w:p>
-    <w:bookmarkEnd w:id="40"/>
-    <w:bookmarkStart w:id="41" w:name="X959560e89fb19d54629474460c75a36ce5e6d02"/>
+    <w:bookmarkEnd w:id="41"/>
+    <w:bookmarkStart w:id="42" w:name="hạn-chế-về-nhân-quả"/>
     <w:p>
       <w:pPr>
         <w:pStyle w:val="Heading3"/>
@@ -1990,8 +2219,8 @@
         <w:t xml:space="preserve">Thiết kế cross-sectional (hoặc pooled panel nhưng với WBES không phải là panel thực sự cho cùng doanh nghiệp qua thời gian) giới hạn khả năng suy luận nhân quả. Quan hệ I→P có thể bị ảnh hưởng bởi reverse causality: doanh nghiệp hiệu quả hơn có thể có nhiều nguồn lực để quốc tế hóa hơn, tạo ra chiều nhân quả ngược lại. Country fixed effects và year fixed effects giúp kiểm soát một phần, nhưng không giải quyết hoàn toàn vấn đề endogeneity.</w:t>
       </w:r>
     </w:p>
-    <w:bookmarkEnd w:id="41"/>
-    <w:bookmarkStart w:id="42" w:name="Xbd928791aa65151cf467be0328d1674d176e909"/>
+    <w:bookmarkEnd w:id="42"/>
+    <w:bookmarkStart w:id="43" w:name="hướng-nghiên-cứu-tương-lai"/>
     <w:p>
       <w:pPr>
         <w:pStyle w:val="Heading3"/>
@@ -2075,9 +2304,9 @@
         </w:pict>
       </w:r>
     </w:p>
-    <w:bookmarkEnd w:id="42"/>
     <w:bookmarkEnd w:id="43"/>
-    <w:bookmarkStart w:id="48" w:name="X3298e6974611109580cc451c12e8b21e51ab986"/>
+    <w:bookmarkEnd w:id="44"/>
+    <w:bookmarkStart w:id="49" w:name="kết-luận"/>
     <w:p>
       <w:pPr>
         <w:pStyle w:val="Heading2"/>
@@ -2086,7 +2315,7 @@
         <w:t xml:space="preserve">5.6 Kết luận</w:t>
       </w:r>
     </w:p>
-    <w:bookmarkStart w:id="44" w:name="X908ec0d26c8b6e22d0478e29897c5c86bef9e95"/>
+    <w:bookmarkStart w:id="45" w:name="tổng-kết-tám-nghiên-cứu"/>
     <w:p>
       <w:pPr>
         <w:pStyle w:val="Heading3"/>
@@ -2191,7 +2420,7 @@
         <w:t xml:space="preserve"> </w:t>
       </w:r>
       <w:r>
-        <w:t xml:space="preserve">(bản thảo đang chuẩn bị, Đỗ &amp; Phan, 2026): phân tích Việt Nam (Lower-mid Transition), xác nhận inverted-U với TP = 39,3–46,2%, TCI là moderator dương có ý nghĩa.</w:t>
+        <w:t xml:space="preserve">(JABS under review, Đỗ &amp; Phan, 2026): phân tích Việt Nam (Lower-mid Transition), xác nhận inverted-U với TP = 39,3–46,2%, TCI là moderator dương có ý nghĩa.</w:t>
       </w:r>
     </w:p>
     <w:p>
@@ -2212,7 +2441,7 @@
         <w:t xml:space="preserve"> </w:t>
       </w:r>
       <w:r>
-        <w:t xml:space="preserve">(bản thảo đang chuẩn bị, Đỗ &amp; Phan, 2026): phân tích Singapore (Advanced Innovation), xác nhận inverted-U với TP ≈ 88,6% (rộng CI), DAI khuếch đại tại mức FSTS cao.</w:t>
+        <w:t xml:space="preserve">(MIR under review, Đỗ &amp; Phan, 2026): phân tích Singapore (Advanced Innovation), xác nhận inverted-U với TP ≈ 88,6% (rộng CI), DAI khuếch đại tại mức FSTS cao.</w:t>
       </w:r>
     </w:p>
     <w:p>
@@ -2233,7 +2462,7 @@
         <w:t xml:space="preserve"> </w:t>
       </w:r>
       <w:r>
-        <w:t xml:space="preserve">(bản thảo đang chuẩn bị, Đỗ &amp; Phan, 2026): phân tích Trung Quốc 2012–2024 (Upper-middle), xác nhận inverted-U ổn định theo thời gian (TP ≈ 48,78%, Paternoster</w:t>
+        <w:t xml:space="preserve">(IJOEM under review, Đỗ &amp; Phan, 2026): phân tích Trung Quốc 2012–2024 (Upper-middle), xác nhận inverted-U ổn định theo thời gian (TP ≈ 48,78%, Paternoster</w:t>
       </w:r>
       <w:r>
         <w:t xml:space="preserve"> </w:t>
@@ -2535,7 +2764,17 @@
         <w:t xml:space="preserve"> </w:t>
       </w:r>
       <w:r>
-        <w:t xml:space="preserve">từ SIDS/Frontier (~55%) xuống Advanced Innovation (~28%), TCI level effect β≈+0,344**, DAI level effect phổ quát β=+0,155*** + DAI×ICRV p=.012 (digital shield mạnh nhất khi thể chế yếu).</w:t>
+        <w:t xml:space="preserve">từ SIDS/Frontier (~55%) xuống Advanced Innovation (~28%), TCI level effect β≈+0,344</w:t>
+      </w:r>
+      <w:r>
+        <w:rPr>
+          <w:bCs/>
+          <w:b/>
+        </w:rPr>
+        <w:t xml:space="preserve">, DAI level effect phổ quát β=+0,155</w:t>
+      </w:r>
+      <w:r>
+        <w:t xml:space="preserve">* + DAI×ICRV p=.012 (digital shield mạnh nhất khi thể chế yếu).</w:t>
       </w:r>
     </w:p>
     <w:p>
@@ -2652,8 +2891,8 @@
         <w:t xml:space="preserve">, FIP xác nhận — quan hệ âm đơn điệu không có turning point.</w:t>
       </w:r>
     </w:p>
-    <w:bookmarkEnd w:id="44"/>
-    <w:bookmarkStart w:id="45" w:name="X9556672229511acc75e7a88561876b51568dedf"/>
+    <w:bookmarkEnd w:id="45"/>
+    <w:bookmarkStart w:id="46" w:name="phát-hiện-trung-tâm"/>
     <w:p>
       <w:pPr>
         <w:pStyle w:val="Heading3"/>
@@ -2679,7 +2918,21 @@
           <w:bCs/>
           <w:b/>
         </w:rPr>
-        <w:t xml:space="preserve">"Không có một mức độ quốc tế hóa tối ưu duy nhất — điểm uốn phụ thuộc vào thể chế, và trong điều kiện thể chế cực yếu, quốc tế hóa có thể gây ra bất lợi hiệu quả thay vì lợi ích."</w:t>
+        <w:t xml:space="preserve">“</w:t>
+      </w:r>
+      <w:r>
+        <w:rPr>
+          <w:bCs/>
+          <w:b/>
+        </w:rPr>
+        <w:t xml:space="preserve">Không có một mức độ quốc tế hóa tối ưu duy nhất — điểm uốn phụ thuộc vào thể chế, và trong điều kiện thể chế cực yếu, quốc tế hóa có thể gây ra bất lợi hiệu quả thay vì lợi ích.</w:t>
+      </w:r>
+      <w:r>
+        <w:rPr>
+          <w:bCs/>
+          <w:b/>
+        </w:rPr>
+        <w:t xml:space="preserve">”</w:t>
       </w:r>
     </w:p>
     <w:p>
@@ -2722,8 +2975,8 @@
         <w:t xml:space="preserve">của chất lượng thể chế theo ICRV — cao nhất ở Frontier/SIDS (~55% FSTS), thấp nhất ở Advanced Innovation (~28% FSTS).</w:t>
       </w:r>
     </w:p>
-    <w:bookmarkEnd w:id="45"/>
-    <w:bookmarkStart w:id="46" w:name="X0e99b1254b4b67b0d58ad32605b3382cafdc23f"/>
+    <w:bookmarkEnd w:id="46"/>
+    <w:bookmarkStart w:id="47" w:name="ý-nghĩa-đối-với-lý-thuyết-và-thực-tiễn"/>
     <w:p>
       <w:pPr>
         <w:pStyle w:val="Heading3"/>
@@ -2748,8 +3001,8 @@
         <w:t xml:space="preserve">Về thực tiễn, luận án cung cấp cơ sở để nhà hoạch định chính sách và nhà quản trị doanh nghiệp tại từng bối cảnh ICRV cụ thể hiệu chỉnh chiến lược quốc tế hóa phù hợp — không áp dụng máy móc bài học từ Singapore hay Nhật Bản vào bối cảnh Việt Nam hay SIDS, mà nhận ra sự phụ thuộc bối cảnh như là nguyên lý căn bản trong hoạch định chiến lược quốc tế hóa.</w:t>
       </w:r>
     </w:p>
-    <w:bookmarkEnd w:id="46"/>
-    <w:bookmarkStart w:id="47" w:name="X419817a82cb35cfdb5a0df5261d5a194f2fd9ca"/>
+    <w:bookmarkEnd w:id="47"/>
+    <w:bookmarkStart w:id="48" w:name="lời-kết"/>
     <w:p>
       <w:pPr>
         <w:pStyle w:val="Heading3"/>
@@ -2786,12 +3039,11 @@
         </w:pict>
       </w:r>
     </w:p>
-    <w:bookmarkEnd w:id="47"/>
     <w:bookmarkEnd w:id="48"/>
     <w:bookmarkEnd w:id="49"/>
     <w:sectPr>
       <w:pgSz w:h="16838" w:w="11906"/>
-      <w:pgMar w:bottom="1134" w:left="1701" w:right="1134" w:top="1134"/>
+      <w:pgMar w:bottom="1417" w:left="1417" w:right="1417" w:top="1417"/>
     </w:sectPr>
   </w:body>
 </w:document>
@@ -3008,13 +3260,13 @@
     <w:name w:val="Normal"/>
     <w:qFormat/>
     <w:pPr>
-      <w:spacing w:line="360" w:lineRule="auto"/>
+      <w:spacing w:line="276" w:lineRule="auto"/>
       <w:jc w:val="both"/>
     </w:pPr>
     <w:rPr>
       <w:rFonts w:ascii="Times New Roman" w:eastAsia="Times New Roman" w:hAnsi="Times New Roman"/>
       <w:color w:val="000000"/>
-      <w:sz w:val="26"/>
+      <w:sz w:val="24"/>
     </w:rPr>
   </w:style>
   <w:style w:styleId="BodyText" w:type="paragraph">
@@ -3022,14 +3274,14 @@
     <w:basedOn w:val="Normal"/>
     <w:link w:val="BodyTextChar"/>
     <w:pPr>
-      <w:spacing w:after="180" w:before="180" w:line="360" w:lineRule="auto"/>
+      <w:spacing w:after="180" w:before="180" w:line="276" w:lineRule="auto"/>
       <w:jc w:val="both"/>
     </w:pPr>
     <w:qFormat/>
     <w:rPr>
       <w:rFonts w:ascii="Times New Roman" w:eastAsia="Times New Roman" w:hAnsi="Times New Roman"/>
       <w:color w:val="000000"/>
-      <w:sz w:val="26"/>
+      <w:sz w:val="24"/>
     </w:rPr>
   </w:style>
   <w:style w:customStyle="1" w:styleId="FirstParagraph" w:type="paragraph">
@@ -3038,13 +3290,13 @@
     <w:next w:val="BodyText"/>
     <w:qFormat/>
     <w:pPr>
-      <w:spacing w:line="360" w:lineRule="auto"/>
+      <w:spacing w:line="276" w:lineRule="auto"/>
       <w:jc w:val="both"/>
     </w:pPr>
     <w:rPr>
       <w:rFonts w:ascii="Times New Roman" w:eastAsia="Times New Roman" w:hAnsi="Times New Roman"/>
       <w:color w:val="000000"/>
-      <w:sz w:val="26"/>
+      <w:sz w:val="24"/>
     </w:rPr>
   </w:style>
   <w:style w:customStyle="1" w:styleId="Compact" w:type="paragraph">
@@ -3052,13 +3304,13 @@
     <w:basedOn w:val="BodyText"/>
     <w:qFormat/>
     <w:pPr>
-      <w:spacing w:after="36" w:before="36" w:line="360" w:lineRule="auto"/>
+      <w:spacing w:after="36" w:before="36" w:line="276" w:lineRule="auto"/>
       <w:jc w:val="both"/>
     </w:pPr>
     <w:rPr>
       <w:rFonts w:ascii="Times New Roman" w:eastAsia="Times New Roman" w:hAnsi="Times New Roman"/>
       <w:color w:val="000000"/>
-      <w:sz w:val="26"/>
+      <w:sz w:val="24"/>
     </w:rPr>
   </w:style>
   <w:style w:styleId="Title" w:type="paragraph">
@@ -3069,7 +3321,7 @@
     <w:pPr>
       <w:keepNext/>
       <w:keepLines/>
-      <w:spacing w:after="240" w:before="480" w:line="360" w:lineRule="auto"/>
+      <w:spacing w:after="240" w:before="480" w:line="276" w:lineRule="auto"/>
       <w:jc w:val="both"/>
     </w:pPr>
     <w:rPr>
@@ -3077,7 +3329,7 @@
       <w:b/>
       <w:bCs/>
       <w:color w:val="000000"/>
-      <w:sz w:val="26"/>
+      <w:sz w:val="24"/>
       <w:szCs w:val="36"/>
     </w:rPr>
   </w:style>
@@ -3089,13 +3341,13 @@
     <w:pPr>
       <w:keepNext/>
       <w:keepLines/>
-      <w:spacing w:after="240" w:before="240" w:line="360" w:lineRule="auto"/>
+      <w:spacing w:after="240" w:before="240" w:line="276" w:lineRule="auto"/>
       <w:jc w:val="both"/>
     </w:pPr>
     <w:rPr>
       <w:rFonts w:ascii="Times New Roman" w:eastAsia="Times New Roman" w:hAnsi="Times New Roman"/>
       <w:color w:val="000000"/>
-      <w:sz w:val="26"/>
+      <w:sz w:val="24"/>
       <w:szCs w:val="30"/>
     </w:rPr>
   </w:style>
@@ -3106,13 +3358,13 @@
     <w:pPr>
       <w:keepNext/>
       <w:keepLines/>
-      <w:spacing w:line="360" w:lineRule="auto"/>
+      <w:spacing w:line="276" w:lineRule="auto"/>
       <w:jc w:val="both"/>
     </w:pPr>
     <w:rPr>
       <w:rFonts w:ascii="Times New Roman" w:eastAsia="Times New Roman" w:hAnsi="Times New Roman"/>
       <w:color w:val="000000"/>
-      <w:sz w:val="26"/>
+      <w:sz w:val="24"/>
     </w:rPr>
   </w:style>
   <w:style w:styleId="Date" w:type="paragraph">
@@ -3122,13 +3374,13 @@
     <w:pPr>
       <w:keepNext/>
       <w:keepLines/>
-      <w:spacing w:line="360" w:lineRule="auto"/>
+      <w:spacing w:line="276" w:lineRule="auto"/>
       <w:jc w:val="both"/>
     </w:pPr>
     <w:rPr>
       <w:rFonts w:ascii="Times New Roman" w:eastAsia="Times New Roman" w:hAnsi="Times New Roman"/>
       <w:color w:val="000000"/>
-      <w:sz w:val="26"/>
+      <w:sz w:val="24"/>
     </w:rPr>
   </w:style>
   <w:style w:customStyle="1" w:styleId="AbstractTitle" w:type="paragraph">
@@ -3140,11 +3392,11 @@
       <w:keepNext/>
       <w:keepLines/>
       <w:jc w:val="both"/>
-      <w:spacing w:after="0" w:before="300" w:line="360" w:lineRule="auto"/>
+      <w:spacing w:after="0" w:before="300" w:line="276" w:lineRule="auto"/>
     </w:pPr>
     <w:rPr>
       <w:color w:val="000000"/>
-      <w:sz w:val="26"/>
+      <w:sz w:val="24"/>
       <w:szCs w:val="20"/>
       <w:rFonts w:ascii="Times New Roman" w:eastAsia="Times New Roman" w:hAnsi="Times New Roman"/>
       <w:b/>
@@ -3158,13 +3410,13 @@
     <w:pPr>
       <w:keepNext/>
       <w:keepLines/>
-      <w:spacing w:after="300" w:before="100" w:line="360" w:lineRule="auto"/>
+      <w:spacing w:after="300" w:before="100" w:line="276" w:lineRule="auto"/>
       <w:jc w:val="both"/>
     </w:pPr>
     <w:rPr>
       <w:rFonts w:ascii="Times New Roman" w:eastAsia="Times New Roman" w:hAnsi="Times New Roman"/>
       <w:color w:val="000000"/>
-      <w:sz w:val="26"/>
+      <w:sz w:val="24"/>
       <w:szCs w:val="20"/>
     </w:rPr>
   </w:style>
@@ -3174,13 +3426,13 @@
     <w:next w:val="Bibliography"/>
     <w:qFormat/>
     <w:pPr>
-      <w:spacing w:line="360" w:lineRule="auto"/>
+      <w:spacing w:line="276" w:lineRule="auto"/>
       <w:jc w:val="both"/>
     </w:pPr>
     <w:rPr>
       <w:rFonts w:ascii="Times New Roman" w:eastAsia="Times New Roman" w:hAnsi="Times New Roman"/>
       <w:color w:val="000000"/>
-      <w:sz w:val="26"/>
+      <w:sz w:val="24"/>
     </w:rPr>
   </w:style>
   <w:style w:styleId="Heading1" w:type="paragraph">
@@ -3192,7 +3444,7 @@
     <w:pPr>
       <w:keepNext/>
       <w:keepLines/>
-      <w:spacing w:after="0" w:before="480" w:line="360" w:lineRule="auto"/>
+      <w:spacing w:after="0" w:before="480" w:line="276" w:lineRule="auto"/>
       <w:jc w:val="both"/>
       <w:outlineLvl w:val="0"/>
     </w:pPr>
@@ -3201,7 +3453,7 @@
       <w:b/>
       <w:bCs/>
       <w:color w:val="000000"/>
-      <w:sz w:val="26"/>
+      <w:sz w:val="24"/>
       <w:szCs w:val="32"/>
     </w:rPr>
   </w:style>
@@ -3215,7 +3467,7 @@
     <w:pPr>
       <w:keepNext/>
       <w:keepLines/>
-      <w:spacing w:after="0" w:before="200" w:line="360" w:lineRule="auto"/>
+      <w:spacing w:after="0" w:before="200" w:line="276" w:lineRule="auto"/>
       <w:jc w:val="both"/>
       <w:outlineLvl w:val="1"/>
     </w:pPr>
@@ -3224,7 +3476,7 @@
       <w:b/>
       <w:bCs/>
       <w:color w:val="000000"/>
-      <w:sz w:val="26"/>
+      <w:sz w:val="24"/>
       <w:szCs w:val="28"/>
     </w:rPr>
   </w:style>
@@ -3238,7 +3490,7 @@
     <w:pPr>
       <w:keepNext/>
       <w:keepLines/>
-      <w:spacing w:after="0" w:before="200" w:line="360" w:lineRule="auto"/>
+      <w:spacing w:after="0" w:before="200" w:line="276" w:lineRule="auto"/>
       <w:jc w:val="both"/>
       <w:outlineLvl w:val="2"/>
     </w:pPr>
@@ -3247,7 +3499,7 @@
       <w:b/>
       <w:bCs/>
       <w:color w:val="000000"/>
-      <w:sz w:val="26"/>
+      <w:sz w:val="24"/>
       <w:szCs w:val="24"/>
     </w:rPr>
   </w:style>
@@ -3261,7 +3513,7 @@
     <w:pPr>
       <w:keepNext/>
       <w:keepLines/>
-      <w:spacing w:after="0" w:before="200" w:line="360" w:lineRule="auto"/>
+      <w:spacing w:after="0" w:before="200" w:line="276" w:lineRule="auto"/>
       <w:jc w:val="both"/>
       <w:outlineLvl w:val="3"/>
     </w:pPr>
@@ -3270,7 +3522,7 @@
       <w:i/>
       <w:bCs/>
       <w:color w:val="000000"/>
-      <w:sz w:val="26"/>
+      <w:sz w:val="24"/>
       <w:szCs w:val="24"/>
     </w:rPr>
   </w:style>
@@ -3284,7 +3536,7 @@
     <w:pPr>
       <w:keepNext/>
       <w:keepLines/>
-      <w:spacing w:after="0" w:before="200" w:line="360" w:lineRule="auto"/>
+      <w:spacing w:after="0" w:before="200" w:line="276" w:lineRule="auto"/>
       <w:jc w:val="both"/>
       <w:outlineLvl w:val="4"/>
     </w:pPr>
@@ -3292,7 +3544,7 @@
       <w:rFonts w:ascii="Times New Roman" w:asciiTheme="majorHAnsi" w:cstheme="majorBidi" w:eastAsia="Times New Roman" w:eastAsiaTheme="majorEastAsia" w:hAnsi="Times New Roman" w:hAnsiTheme="majorHAnsi"/>
       <w:iCs/>
       <w:color w:val="000000"/>
-      <w:sz w:val="26"/>
+      <w:sz w:val="24"/>
       <w:szCs w:val="24"/>
     </w:rPr>
   </w:style>
@@ -3306,14 +3558,14 @@
     <w:pPr>
       <w:keepNext/>
       <w:keepLines/>
-      <w:spacing w:after="0" w:before="200" w:line="360" w:lineRule="auto"/>
+      <w:spacing w:after="0" w:before="200" w:line="276" w:lineRule="auto"/>
       <w:jc w:val="both"/>
       <w:outlineLvl w:val="5"/>
     </w:pPr>
     <w:rPr>
       <w:rFonts w:ascii="Times New Roman" w:asciiTheme="majorHAnsi" w:cstheme="majorBidi" w:eastAsia="Times New Roman" w:eastAsiaTheme="majorEastAsia" w:hAnsi="Times New Roman" w:hAnsiTheme="majorHAnsi"/>
       <w:color w:val="000000"/>
-      <w:sz w:val="26"/>
+      <w:sz w:val="24"/>
       <w:szCs w:val="24"/>
     </w:rPr>
   </w:style>
@@ -3327,14 +3579,14 @@
     <w:pPr>
       <w:keepNext/>
       <w:keepLines/>
-      <w:spacing w:after="0" w:before="200" w:line="360" w:lineRule="auto"/>
+      <w:spacing w:after="0" w:before="200" w:line="276" w:lineRule="auto"/>
       <w:jc w:val="both"/>
       <w:outlineLvl w:val="6"/>
     </w:pPr>
     <w:rPr>
       <w:rFonts w:ascii="Times New Roman" w:asciiTheme="majorHAnsi" w:cstheme="majorBidi" w:eastAsia="Times New Roman" w:eastAsiaTheme="majorEastAsia" w:hAnsi="Times New Roman" w:hAnsiTheme="majorHAnsi"/>
       <w:color w:val="000000"/>
-      <w:sz w:val="26"/>
+      <w:sz w:val="24"/>
       <w:szCs w:val="24"/>
     </w:rPr>
   </w:style>
@@ -3348,14 +3600,14 @@
     <w:pPr>
       <w:keepNext/>
       <w:keepLines/>
-      <w:spacing w:after="0" w:before="200" w:line="360" w:lineRule="auto"/>
+      <w:spacing w:after="0" w:before="200" w:line="276" w:lineRule="auto"/>
       <w:jc w:val="both"/>
       <w:outlineLvl w:val="7"/>
     </w:pPr>
     <w:rPr>
       <w:rFonts w:ascii="Times New Roman" w:asciiTheme="majorHAnsi" w:cstheme="majorBidi" w:eastAsia="Times New Roman" w:eastAsiaTheme="majorEastAsia" w:hAnsi="Times New Roman" w:hAnsiTheme="majorHAnsi"/>
       <w:color w:val="000000"/>
-      <w:sz w:val="26"/>
+      <w:sz w:val="24"/>
       <w:szCs w:val="24"/>
     </w:rPr>
   </w:style>
@@ -3369,14 +3621,14 @@
     <w:pPr>
       <w:keepNext/>
       <w:keepLines/>
-      <w:spacing w:after="0" w:before="200" w:line="360" w:lineRule="auto"/>
+      <w:spacing w:after="0" w:before="200" w:line="276" w:lineRule="auto"/>
       <w:jc w:val="both"/>
       <w:outlineLvl w:val="8"/>
     </w:pPr>
     <w:rPr>
       <w:rFonts w:ascii="Times New Roman" w:asciiTheme="majorHAnsi" w:cstheme="majorBidi" w:eastAsia="Times New Roman" w:eastAsiaTheme="majorEastAsia" w:hAnsi="Times New Roman" w:hAnsiTheme="majorHAnsi"/>
       <w:color w:val="000000"/>
-      <w:sz w:val="26"/>
+      <w:sz w:val="24"/>
       <w:szCs w:val="24"/>
     </w:rPr>
   </w:style>
@@ -3388,14 +3640,14 @@
     <w:unhideWhenUsed/>
     <w:qFormat/>
     <w:pPr>
-      <w:spacing w:after="100" w:before="100" w:line="360" w:lineRule="auto"/>
+      <w:spacing w:after="100" w:before="100" w:line="276" w:lineRule="auto"/>
       <w:ind w:firstLine="0" w:left="480" w:right="480"/>
       <w:jc w:val="both"/>
     </w:pPr>
     <w:rPr>
       <w:rFonts w:ascii="Times New Roman" w:eastAsia="Times New Roman" w:hAnsi="Times New Roman"/>
       <w:color w:val="000000"/>
-      <w:sz w:val="26"/>
+      <w:sz w:val="24"/>
     </w:rPr>
   </w:style>
   <w:style w:styleId="FootnoteText" w:type="paragraph">
@@ -3406,13 +3658,13 @@
     <w:unhideWhenUsed/>
     <w:qFormat/>
     <w:pPr>
-      <w:spacing w:line="360" w:lineRule="auto"/>
+      <w:spacing w:line="276" w:lineRule="auto"/>
       <w:jc w:val="both"/>
     </w:pPr>
     <w:rPr>
       <w:rFonts w:ascii="Times New Roman" w:eastAsia="Times New Roman" w:hAnsi="Times New Roman"/>
       <w:color w:val="000000"/>
-      <w:sz w:val="26"/>
+      <w:sz w:val="24"/>
     </w:rPr>
   </w:style>
   <w:style w:default="1" w:styleId="DefaultParagraphFont" w:type="character">
@@ -3422,7 +3674,7 @@
     <w:rPr>
       <w:rFonts w:ascii="Times New Roman" w:eastAsia="Times New Roman" w:hAnsi="Times New Roman"/>
       <w:color w:val="000000"/>
-      <w:sz w:val="26"/>
+      <w:sz w:val="24"/>
     </w:rPr>
   </w:style>
   <w:style w:default="1" w:styleId="Table" w:type="table">
@@ -3432,13 +3684,13 @@
     <w:unhideWhenUsed/>
     <w:qFormat/>
     <w:pPr>
-      <w:spacing w:line="360" w:lineRule="auto"/>
+      <w:spacing w:line="276" w:lineRule="auto"/>
       <w:jc w:val="both"/>
     </w:pPr>
     <w:rPr>
       <w:rFonts w:ascii="Times New Roman" w:eastAsia="Times New Roman" w:hAnsi="Times New Roman"/>
       <w:color w:val="000000"/>
-      <w:sz w:val="26"/>
+      <w:sz w:val="24"/>
     </w:rPr>
     <w:tblPr>
       <w:tblInd w:type="dxa" w:w="0"/>
@@ -3472,27 +3724,27 @@
     <w:pPr>
       <w:keepNext/>
       <w:keepLines/>
-      <w:spacing w:after="0" w:line="360" w:lineRule="auto"/>
+      <w:spacing w:after="0" w:line="276" w:lineRule="auto"/>
       <w:jc w:val="both"/>
     </w:pPr>
     <w:rPr>
       <w:rFonts w:ascii="Times New Roman" w:eastAsia="Times New Roman" w:hAnsi="Times New Roman"/>
       <w:b/>
       <w:color w:val="000000"/>
-      <w:sz w:val="26"/>
+      <w:sz w:val="24"/>
     </w:rPr>
   </w:style>
   <w:style w:customStyle="1" w:styleId="Definition" w:type="paragraph">
     <w:name w:val="Definition"/>
     <w:basedOn w:val="Normal"/>
     <w:pPr>
-      <w:spacing w:line="360" w:lineRule="auto"/>
+      <w:spacing w:line="276" w:lineRule="auto"/>
       <w:jc w:val="both"/>
     </w:pPr>
     <w:rPr>
       <w:rFonts w:ascii="Times New Roman" w:eastAsia="Times New Roman" w:hAnsi="Times New Roman"/>
       <w:color w:val="000000"/>
-      <w:sz w:val="26"/>
+      <w:sz w:val="24"/>
     </w:rPr>
   </w:style>
   <w:style w:styleId="Caption" w:type="paragraph">
@@ -3500,14 +3752,14 @@
     <w:basedOn w:val="Normal"/>
     <w:link w:val="BodyTextChar"/>
     <w:pPr>
-      <w:spacing w:after="120" w:before="0" w:line="360" w:lineRule="auto"/>
+      <w:spacing w:after="120" w:before="0" w:line="276" w:lineRule="auto"/>
       <w:jc w:val="both"/>
     </w:pPr>
     <w:rPr>
       <w:rFonts w:ascii="Times New Roman" w:eastAsia="Times New Roman" w:hAnsi="Times New Roman"/>
       <w:i/>
       <w:color w:val="000000"/>
-      <w:sz w:val="26"/>
+      <w:sz w:val="24"/>
     </w:rPr>
   </w:style>
   <w:style w:customStyle="1" w:styleId="TableCaption" w:type="paragraph">
@@ -3515,39 +3767,39 @@
     <w:basedOn w:val="Caption"/>
     <w:pPr>
       <w:keepNext/>
-      <w:spacing w:line="360" w:lineRule="auto"/>
+      <w:spacing w:line="276" w:lineRule="auto"/>
       <w:jc w:val="both"/>
     </w:pPr>
     <w:rPr>
       <w:rFonts w:ascii="Times New Roman" w:eastAsia="Times New Roman" w:hAnsi="Times New Roman"/>
       <w:color w:val="000000"/>
-      <w:sz w:val="26"/>
+      <w:sz w:val="24"/>
     </w:rPr>
   </w:style>
   <w:style w:customStyle="1" w:styleId="ImageCaption" w:type="paragraph">
     <w:name w:val="Image Caption"/>
     <w:basedOn w:val="Caption"/>
     <w:pPr>
-      <w:spacing w:line="360" w:lineRule="auto"/>
+      <w:spacing w:line="276" w:lineRule="auto"/>
       <w:jc w:val="both"/>
     </w:pPr>
     <w:rPr>
       <w:rFonts w:ascii="Times New Roman" w:eastAsia="Times New Roman" w:hAnsi="Times New Roman"/>
       <w:color w:val="000000"/>
-      <w:sz w:val="26"/>
+      <w:sz w:val="24"/>
     </w:rPr>
   </w:style>
   <w:style w:customStyle="1" w:styleId="Figure" w:type="paragraph">
     <w:name w:val="Figure"/>
     <w:basedOn w:val="Normal"/>
     <w:pPr>
-      <w:spacing w:line="360" w:lineRule="auto"/>
+      <w:spacing w:line="276" w:lineRule="auto"/>
       <w:jc w:val="both"/>
     </w:pPr>
     <w:rPr>
       <w:rFonts w:ascii="Times New Roman" w:eastAsia="Times New Roman" w:hAnsi="Times New Roman"/>
       <w:color w:val="000000"/>
-      <w:sz w:val="26"/>
+      <w:sz w:val="24"/>
     </w:rPr>
   </w:style>
   <w:style w:customStyle="1" w:styleId="CaptionedFigure" w:type="paragraph">
@@ -3555,13 +3807,13 @@
     <w:basedOn w:val="Figure"/>
     <w:pPr>
       <w:keepNext/>
-      <w:spacing w:line="360" w:lineRule="auto"/>
+      <w:spacing w:line="276" w:lineRule="auto"/>
       <w:jc w:val="both"/>
     </w:pPr>
     <w:rPr>
       <w:rFonts w:ascii="Times New Roman" w:eastAsia="Times New Roman" w:hAnsi="Times New Roman"/>
       <w:color w:val="000000"/>
-      <w:sz w:val="26"/>
+      <w:sz w:val="24"/>
     </w:rPr>
   </w:style>
   <w:style w:customStyle="1" w:styleId="BodyTextChar" w:type="character">
@@ -3571,7 +3823,7 @@
     <w:rPr>
       <w:rFonts w:ascii="Times New Roman" w:eastAsia="Times New Roman" w:hAnsi="Times New Roman"/>
       <w:color w:val="000000"/>
-      <w:sz w:val="26"/>
+      <w:sz w:val="24"/>
     </w:rPr>
   </w:style>
   <w:style w:customStyle="1" w:styleId="VerbatimChar" w:type="character">
@@ -3580,7 +3832,7 @@
     <w:rPr>
       <w:rFonts w:ascii="Times New Roman" w:eastAsia="Times New Roman" w:hAnsi="Times New Roman"/>
       <w:color w:val="000000"/>
-      <w:sz w:val="26"/>
+      <w:sz w:val="24"/>
     </w:rPr>
   </w:style>
   <w:style w:customStyle="1" w:styleId="SectionNumber" w:type="character">
@@ -3589,7 +3841,7 @@
     <w:rPr>
       <w:rFonts w:ascii="Times New Roman" w:eastAsia="Times New Roman" w:hAnsi="Times New Roman"/>
       <w:color w:val="000000"/>
-      <w:sz w:val="26"/>
+      <w:sz w:val="24"/>
     </w:rPr>
   </w:style>
   <w:style w:styleId="FootnoteReference" w:type="character">
@@ -3598,7 +3850,7 @@
     <w:rPr>
       <w:rFonts w:ascii="Times New Roman" w:eastAsia="Times New Roman" w:hAnsi="Times New Roman"/>
       <w:color w:val="000000"/>
-      <w:sz w:val="26"/>
+      <w:sz w:val="24"/>
       <w:vertAlign w:val="superscript"/>
     </w:rPr>
   </w:style>
@@ -3608,7 +3860,7 @@
     <w:rPr>
       <w:rFonts w:ascii="Times New Roman" w:eastAsia="Times New Roman" w:hAnsi="Times New Roman"/>
       <w:color w:val="000000"/>
-      <w:sz w:val="26"/>
+      <w:sz w:val="24"/>
     </w:rPr>
   </w:style>
   <w:style w:styleId="TOCHeading" w:type="paragraph">
@@ -3619,7 +3871,7 @@
     <w:unhideWhenUsed/>
     <w:qFormat/>
     <w:pPr>
-      <w:spacing w:before="240" w:line="360" w:lineRule="auto"/>
+      <w:spacing w:before="240" w:line="276" w:lineRule="auto"/>
       <w:jc w:val="both"/>
       <w:outlineLvl w:val="9"/>
     </w:pPr>
@@ -3628,7 +3880,7 @@
       <w:b w:val="0"/>
       <w:bCs w:val="0"/>
       <w:color w:val="000000"/>
-      <w:sz w:val="26"/>
+      <w:sz w:val="24"/>
     </w:rPr>
   </w:style>
   <w:style w:type="paragraph" w:customStyle="1" w:styleId="SourceCode">

</xml_diff>

<commit_message>
feat(dissertation): add P9 India discussion to chuong_5 (5.1.5 CDCM boundary condition)
Brought the India threshold-collapse discussion from the source branch into chuong_5 as a new 5.1.5
'An Do, Dieu kien bien pham vi ap dung cua khung CDCM (P9)': institutional stability is a precondition
for the inverted-U; the 2025 curvature collapse under cumulative reform (demonetisation, GST, IBC, UPI,
PLI, COVID, Atmanirbhar Bharat) bounds CDCM's scope; the negative Tier-2/UPI interaction (beta=-4.02,
p=.004) refines the public-vs-private digital-infrastructure substitution claim. em-dash-free addition;
docx rebuilt.
</commit_message>
<xml_diff>
--- a/dist/luan_an_ctu/chuong_5_ket_luan_de_xuat_vi.docx
+++ b/dist/luan_an_ctu/chuong_5_ket_luan_de_xuat_vi.docx
@@ -2,7 +2,7 @@
 <file path=word/document.xml><?xml version="1.0" encoding="utf-8"?>
 <w:document xmlns:w="http://schemas.openxmlformats.org/wordprocessingml/2006/main" xmlns:m="http://schemas.openxmlformats.org/officeDocument/2006/math" xmlns:r="http://schemas.openxmlformats.org/officeDocument/2006/relationships" xmlns:o="urn:schemas-microsoft-com:office:office" xmlns:v="urn:schemas-microsoft-com:vml" xmlns:w10="urn:schemas-microsoft-com:office:word" xmlns:a="http://schemas.openxmlformats.org/drawingml/2006/main" xmlns:pic="http://schemas.openxmlformats.org/drawingml/2006/picture" xmlns:wp="http://schemas.openxmlformats.org/drawingml/2006/wordprocessingDrawing">
   <w:body>
-    <w:bookmarkStart w:id="49" w:name="chương-5-kết-luận-và-đề-xuất"/>
+    <w:bookmarkStart w:id="50" w:name="chương-5-kết-luận-và-đề-xuất"/>
     <w:p>
       <w:pPr>
         <w:pStyle w:val="Heading1"/>
@@ -43,7 +43,7 @@
       </w:r>
     </w:p>
     <w:bookmarkEnd w:id="20"/>
-    <w:bookmarkStart w:id="26" w:name="Xa49aadb40c127a83ebe1d91ac222e3bdb8617c2"/>
+    <w:bookmarkStart w:id="27" w:name="Xa49aadb40c127a83ebe1d91ac222e3bdb8617c2"/>
     <w:p>
       <w:pPr>
         <w:pStyle w:val="Heading2"/>
@@ -1108,8 +1108,107 @@
       </w:r>
     </w:p>
     <w:bookmarkEnd w:id="25"/>
+    <w:bookmarkStart w:id="26" w:name="Xb940c15a40429c8118b4029c85838aadcf6bf5a"/>
+    <w:p>
+      <w:pPr>
+        <w:pStyle w:val="Heading3"/>
+      </w:pPr>
+      <w:r>
+        <w:t xml:space="preserve">5.1.5 Ấn Độ, Điều kiện biên phạm vi áp dụng của khung CDCM (P9)</w:t>
+      </w:r>
+    </w:p>
+    <w:p>
+      <w:pPr>
+        <w:pStyle w:val="FirstParagraph"/>
+      </w:pPr>
+      <w:r>
+        <w:rPr>
+          <w:bCs/>
+          <w:b/>
+        </w:rPr>
+        <w:t xml:space="preserve">Ấn Độ và điều kiện biên phạm vi áp dụng của khung CDCM.</w:t>
+      </w:r>
+      <w:r>
+        <w:t xml:space="preserve"> </w:t>
+      </w:r>
+      <w:r>
+        <w:t xml:space="preserve">Phát hiện ngưỡng phá vỡ tại Ấn Độ (P9 (Ấn Độ)) qua giai đoạn 2014–2025 bổ sung một điều kiện biên quan trọng cho khung CDCM. Trong khi quan hệ U ngược được khung dự đoán giả định môi trường thể chế ổn định, sự sụp đổ độ cong tại đợt 2025 dưới áp lực tích lũy của bãi bỏ tiền mặt, GST, IBC, UPI, PLI, COVID-19 và Atmanirbhar Bharat cho thấy bản thân khung CDCM cũng cần điều kiện ổn định thể chế làm tiền đề. Khung này không khẳng định U ngược là quan hệ phổ quát mà là quan hệ có điều kiện. Sự bác bỏ giả thuyết phổ quát của Tier-2 thay thế Tier-1 (qua tương tác âm</w:t>
+      </w:r>
+      <w:r>
+        <w:t xml:space="preserve"> </w:t>
+      </w:r>
+      <m:oMath>
+        <m:r>
+          <m:t>β</m:t>
+        </m:r>
+        <m:r>
+          <m:rPr>
+            <m:sty m:val="p"/>
+          </m:rPr>
+          <m:t>=</m:t>
+        </m:r>
+        <m:r>
+          <m:rPr>
+            <m:sty m:val="p"/>
+          </m:rPr>
+          <m:t>−</m:t>
+        </m:r>
+        <m:r>
+          <m:t>4</m:t>
+        </m:r>
+        <m:r>
+          <m:rPr>
+            <m:sty m:val="p"/>
+          </m:rPr>
+          <m:t>,</m:t>
+        </m:r>
+        <m:r>
+          <m:t>02</m:t>
+        </m:r>
+      </m:oMath>
+      <w:r>
+        <w:t xml:space="preserve">,</w:t>
+      </w:r>
+      <w:r>
+        <w:t xml:space="preserve"> </w:t>
+      </w:r>
+      <m:oMath>
+        <m:r>
+          <m:t>p</m:t>
+        </m:r>
+        <m:r>
+          <m:rPr>
+            <m:sty m:val="p"/>
+          </m:rPr>
+          <m:t>=</m:t>
+        </m:r>
+        <m:r>
+          <m:rPr>
+            <m:sty m:val="p"/>
+          </m:rPr>
+          <m:t>,</m:t>
+        </m:r>
+        <m:r>
+          <m:t>004</m:t>
+        </m:r>
+      </m:oMath>
+      <w:r>
+        <w:t xml:space="preserve"> </w:t>
+      </w:r>
+      <w:r>
+        <w:t xml:space="preserve">tại Ấn Độ) cũng tinh chỉnh đề xuất phụ trợ của khung: hạ tầng số công cộng chỉ thay thế năng lực số tư nhân khi hai loại hạ tầng có cùng định hướng mục đích. UPI hỗ trợ giao dịch nội địa hiệu quả nhưng không thay thế hạ tầng tài chính xuyên biên giới (SWIFT, ngân hàng đại lý, tài trợ thương mại) mà doanh nghiệp xuất khẩu yêu cầu.</w:t>
+      </w:r>
+    </w:p>
+    <w:p>
+      <w:r>
+        <w:pict>
+          <v:rect style="width:0;height:1.5pt" o:hralign="center" o:hrstd="t" o:hr="t"/>
+        </w:pict>
+      </w:r>
+    </w:p>
     <w:bookmarkEnd w:id="26"/>
-    <w:bookmarkStart w:id="30" w:name="X03371f9bf2ea7aa70b56c3fc263517b182b20aa"/>
+    <w:bookmarkEnd w:id="27"/>
+    <w:bookmarkStart w:id="31" w:name="X03371f9bf2ea7aa70b56c3fc263517b182b20aa"/>
     <w:p>
       <w:pPr>
         <w:pStyle w:val="Heading2"/>
@@ -1118,7 +1217,7 @@
         <w:t xml:space="preserve">5.2 So sánh với nghiên cứu trước đây</w:t>
       </w:r>
     </w:p>
-    <w:bookmarkStart w:id="27" w:name="X6d63d205c02653fac9abe4b7c3c003ccf604ac6"/>
+    <w:bookmarkStart w:id="28" w:name="X6d63d205c02653fac9abe4b7c3c003ccf604ac6"/>
     <w:p>
       <w:pPr>
         <w:pStyle w:val="Heading3"/>
@@ -1324,8 +1423,8 @@
         <w:t xml:space="preserve">, không phải sự bất đồng căn bản giữa các nghiên cứu.</w:t>
       </w:r>
     </w:p>
-    <w:bookmarkEnd w:id="27"/>
-    <w:bookmarkStart w:id="28" w:name="X3dc86f682c3e5e98bd0a470c7f8482e8e79f6fb"/>
+    <w:bookmarkEnd w:id="28"/>
+    <w:bookmarkStart w:id="29" w:name="X3dc86f682c3e5e98bd0a470c7f8482e8e79f6fb"/>
     <w:p>
       <w:pPr>
         <w:pStyle w:val="Heading3"/>
@@ -1403,8 +1502,8 @@
         <w:t xml:space="preserve">, luận án mở rộng khung phân tích từ dữ liệu doanh nghiệp Nhật Bản/đa quốc gia sang 49 nền kinh tế châu Á và Thái Bình Dương — bối cảnh underrepresented trong literature Lu và Beamish.</w:t>
       </w:r>
     </w:p>
-    <w:bookmarkEnd w:id="28"/>
-    <w:bookmarkStart w:id="29" w:name="X0883d912591c701a2f1b2fed71cedb09e738376"/>
+    <w:bookmarkEnd w:id="29"/>
+    <w:bookmarkStart w:id="30" w:name="X0883d912591c701a2f1b2fed71cedb09e738376"/>
     <w:p>
       <w:pPr>
         <w:pStyle w:val="Heading3"/>
@@ -1457,9 +1556,9 @@
         </w:pict>
       </w:r>
     </w:p>
-    <w:bookmarkEnd w:id="29"/>
     <w:bookmarkEnd w:id="30"/>
-    <w:bookmarkStart w:id="34" w:name="X358b70cb0587073926db05a46d0ec729e84bb90"/>
+    <w:bookmarkEnd w:id="31"/>
+    <w:bookmarkStart w:id="35" w:name="X358b70cb0587073926db05a46d0ec729e84bb90"/>
     <w:p>
       <w:pPr>
         <w:pStyle w:val="Heading2"/>
@@ -1468,7 +1567,7 @@
         <w:t xml:space="preserve">5.3 Đóng góp lý thuyết</w:t>
       </w:r>
     </w:p>
-    <w:bookmarkStart w:id="31" w:name="Xc6feaeb12e2f91980ada0175fe76f51b8cabb3c"/>
+    <w:bookmarkStart w:id="32" w:name="Xc6feaeb12e2f91980ada0175fe76f51b8cabb3c"/>
     <w:p>
       <w:pPr>
         <w:pStyle w:val="Heading3"/>
@@ -1586,8 +1685,8 @@
         <w:t xml:space="preserve">: DAI hoạt động như lá chắn bù đắp (compensatory asset) trong bối cảnh thể chế yếu, nơi hạ tầng thể chế chưa đủ hỗ trợ cho doanh nghiệp xuất khẩu. Đây là bằng chứng thực nghiệm bổ sung cho lý thuyết về vai trò thay thế giữa thể chế và năng lực số.</w:t>
       </w:r>
     </w:p>
-    <w:bookmarkEnd w:id="31"/>
-    <w:bookmarkStart w:id="32" w:name="X792bf669d8aaad9c154022edb47ba6166013782"/>
+    <w:bookmarkEnd w:id="32"/>
+    <w:bookmarkStart w:id="33" w:name="X792bf669d8aaad9c154022edb47ba6166013782"/>
     <w:p>
       <w:pPr>
         <w:pStyle w:val="Heading3"/>
@@ -1641,8 +1740,8 @@
         <w:t xml:space="preserve">: trong điều kiện nào thì "more internationalization" luôn là "worse performance"? Luận án đề xuất rằng FIP xuất hiện khi ba điều kiện đồng thời: (i) thể chế ICRV ở mức thấp nhất, (ii) quy mô nền kinh tế quá nhỏ để tạo cơ sở nội địa, và (iii) thiếu hỗ trợ năng lực xuất khẩu từ chính sách. Kết hợp ba điều kiện này tạo ra "trap" — bẫy quốc tế hóa bắt buộc — mà không có turning point để thoát khỏi.</w:t>
       </w:r>
     </w:p>
-    <w:bookmarkEnd w:id="32"/>
-    <w:bookmarkStart w:id="33" w:name="Xc949420910752534bec0d1fee728c7a813a2f68"/>
+    <w:bookmarkEnd w:id="33"/>
+    <w:bookmarkStart w:id="34" w:name="Xc949420910752534bec0d1fee728c7a813a2f68"/>
     <w:p>
       <w:pPr>
         <w:pStyle w:val="Heading3"/>
@@ -1719,9 +1818,9 @@
         </w:pict>
       </w:r>
     </w:p>
-    <w:bookmarkEnd w:id="33"/>
     <w:bookmarkEnd w:id="34"/>
-    <w:bookmarkStart w:id="38" w:name="X4f070f4201e8508645625eda6493d60cd486f27"/>
+    <w:bookmarkEnd w:id="35"/>
+    <w:bookmarkStart w:id="39" w:name="X4f070f4201e8508645625eda6493d60cd486f27"/>
     <w:p>
       <w:pPr>
         <w:pStyle w:val="Heading2"/>
@@ -1730,7 +1829,7 @@
         <w:t xml:space="preserve">5.4 Đề xuất chính sách và quản trị</w:t>
       </w:r>
     </w:p>
-    <w:bookmarkStart w:id="35" w:name="X7cdaf271f3298cb573246cb59bc34e92c91d24d"/>
+    <w:bookmarkStart w:id="36" w:name="X7cdaf271f3298cb573246cb59bc34e92c91d24d"/>
     <w:p>
       <w:pPr>
         <w:pStyle w:val="Heading3"/>
@@ -1795,8 +1894,8 @@
         <w:t xml:space="preserve">Đối với Việt Nam cụ thể: turning point dịch chuyển từ 46,2% (2009) xuống 39,3% (2015) là tín hiệu đáng lo ngại. Nếu turning point tiếp tục dịch trái, điều đó hàm ý rằng lợi ích từ xuất khẩu đạt đỉnh sớm hơn và suy giảm nhanh hơn — có thể do cấu trúc xuất khẩu tập trung vào gia công với biên lợi nhuận mỏng. Chính sách nâng cao giá trị gia tăng trong xuất khẩu (moving up the value chain) kết hợp với tăng cường TCI có thể giúp đảo ngược xu hướng này.</w:t>
       </w:r>
     </w:p>
-    <w:bookmarkEnd w:id="35"/>
-    <w:bookmarkStart w:id="36" w:name="Xbb0ebb3f10e960b7d926ccd5aa748ccdb7740d7"/>
+    <w:bookmarkEnd w:id="36"/>
+    <w:bookmarkStart w:id="37" w:name="Xbb0ebb3f10e960b7d926ccd5aa748ccdb7740d7"/>
     <w:p>
       <w:pPr>
         <w:pStyle w:val="Heading3"/>
@@ -1917,8 +2016,8 @@
         <w:t xml:space="preserve">: kết quả FIP là cảnh báo nghiêm túc — đẩy mạnh xuất khẩu trong bối cảnh thiếu năng lực và hỗ trợ thể chế không cải thiện mà còn có thể làm xấu đi hiệu quả hoạt động. Doanh nghiệp SIDS nên ưu tiên xây dựng năng lực nội địa và nâng cao TCI trước khi mở rộng xuất khẩu đáng kể.</w:t>
       </w:r>
     </w:p>
-    <w:bookmarkEnd w:id="36"/>
-    <w:bookmarkStart w:id="37" w:name="X383f9bda7308bcecdf3fd26297745377ea89ee1"/>
+    <w:bookmarkEnd w:id="37"/>
+    <w:bookmarkStart w:id="38" w:name="X383f9bda7308bcecdf3fd26297745377ea89ee1"/>
     <w:p>
       <w:pPr>
         <w:pStyle w:val="Heading3"/>
@@ -1956,9 +2055,9 @@
         <w:t xml:space="preserve">. Cụ thể, ưu tiên nên là: (i) xây dựng hạ tầng logistics và kết nối (giảm chi phí cố định của xuất khẩu); (ii) phát triển năng lực doanh nghiệp thông qua TCI (chứ không chỉ DAI bề mặt); (iii) thiết kế chương trình hỗ trợ xuất khẩu có chọn lọc tập trung vào doanh nghiệp đã có đủ năng lực để hưởng lợi, thay vì khuyến khích đại trà. Nói tóm lại, tránh "bẫy quốc tế hóa bắt buộc" bằng cách đảm bảo rằng các can thiệp chính sách xây dựng năng lực trước khi thúc đẩy mở rộng thị trường.</w:t>
       </w:r>
     </w:p>
-    <w:bookmarkEnd w:id="37"/>
     <w:bookmarkEnd w:id="38"/>
-    <w:bookmarkStart w:id="43" w:name="Xf80a1234b44a7d4089382a2631c25010c604edb"/>
+    <w:bookmarkEnd w:id="39"/>
+    <w:bookmarkStart w:id="44" w:name="Xf80a1234b44a7d4089382a2631c25010c604edb"/>
     <w:p>
       <w:pPr>
         <w:pStyle w:val="Heading2"/>
@@ -1967,7 +2066,7 @@
         <w:t xml:space="preserve">5.5 Hạn chế và hướng nghiên cứu tương lai</w:t>
       </w:r>
     </w:p>
-    <w:bookmarkStart w:id="39" w:name="Xfc21172891b143a859fa6a4cd4308b059abf57d"/>
+    <w:bookmarkStart w:id="40" w:name="Xfc21172891b143a859fa6a4cd4308b059abf57d"/>
     <w:p>
       <w:pPr>
         <w:pStyle w:val="Heading3"/>
@@ -2008,8 +2107,8 @@
         <w:t xml:space="preserve">(tại một thời điểm khảo sát), không thể nắm bắt tính "dynamic" của việc cập nhật và tái cấu hình năng lực số theo thời gian. Điều này có nghĩa là các phát hiện về DAI trong luận án phản ánh mức độ chấp nhận số tại một thời điểm chứ không phải năng lực số năng động theo nghĩa của dynamic capabilities theory (Teece et al., 1997).</w:t>
       </w:r>
     </w:p>
-    <w:bookmarkEnd w:id="39"/>
-    <w:bookmarkStart w:id="40" w:name="X87e10c044c34a8346bd2a0229fbb014435526bd"/>
+    <w:bookmarkEnd w:id="40"/>
+    <w:bookmarkStart w:id="41" w:name="X87e10c044c34a8346bd2a0229fbb014435526bd"/>
     <w:p>
       <w:pPr>
         <w:pStyle w:val="Heading3"/>
@@ -2034,8 +2133,8 @@
         <w:t xml:space="preserve">Phân tích Heckman two-step (hoặc treatment effects models) trong các nghiên cứu tương lai có thể khắc phục phần nào hạn chế này bằng cách mô hình hóa quá trình lựa chọn tham gia xuất khẩu như giai đoạn thứ nhất trước khi ước lượng hiệu quả trong giai đoạn thứ hai.</w:t>
       </w:r>
     </w:p>
-    <w:bookmarkEnd w:id="40"/>
-    <w:bookmarkStart w:id="41" w:name="X959560e89fb19d54629474460c75a36ce5e6d02"/>
+    <w:bookmarkEnd w:id="41"/>
+    <w:bookmarkStart w:id="42" w:name="X959560e89fb19d54629474460c75a36ce5e6d02"/>
     <w:p>
       <w:pPr>
         <w:pStyle w:val="Heading3"/>
@@ -2052,8 +2151,8 @@
         <w:t xml:space="preserve">Thiết kế cross-sectional (hoặc pooled panel nhưng với WBES không phải là panel thực sự cho cùng doanh nghiệp qua thời gian) giới hạn khả năng suy luận nhân quả. Quan hệ I–P có thể bị ảnh hưởng bởi reverse causality: doanh nghiệp hiệu quả hơn có thể có nhiều nguồn lực để quốc tế hóa hơn, tạo ra chiều nhân quả ngược lại. Country fixed effects và year fixed effects giúp kiểm soát một phần, nhưng không giải quyết hoàn toàn vấn đề endogeneity.</w:t>
       </w:r>
     </w:p>
-    <w:bookmarkEnd w:id="41"/>
-    <w:bookmarkStart w:id="42" w:name="Xbd928791aa65151cf467be0328d1674d176e909"/>
+    <w:bookmarkEnd w:id="42"/>
+    <w:bookmarkStart w:id="43" w:name="Xbd928791aa65151cf467be0328d1674d176e909"/>
     <w:p>
       <w:pPr>
         <w:pStyle w:val="Heading3"/>
@@ -2137,9 +2236,9 @@
         </w:pict>
       </w:r>
     </w:p>
-    <w:bookmarkEnd w:id="42"/>
     <w:bookmarkEnd w:id="43"/>
-    <w:bookmarkStart w:id="48" w:name="X3298e6974611109580cc451c12e8b21e51ab986"/>
+    <w:bookmarkEnd w:id="44"/>
+    <w:bookmarkStart w:id="49" w:name="X3298e6974611109580cc451c12e8b21e51ab986"/>
     <w:p>
       <w:pPr>
         <w:pStyle w:val="Heading2"/>
@@ -2148,7 +2247,7 @@
         <w:t xml:space="preserve">5.6 Kết luận</w:t>
       </w:r>
     </w:p>
-    <w:bookmarkStart w:id="44" w:name="X0275a289702f94099779eb7b5961872002d4a98"/>
+    <w:bookmarkStart w:id="45" w:name="X0275a289702f94099779eb7b5961872002d4a98"/>
     <w:p>
       <w:pPr>
         <w:pStyle w:val="Heading3"/>
@@ -2849,8 +2948,8 @@
         <w:t xml:space="preserve">điểm uốn chữ U ngược: TP = 61,8% (2014) → 40,7% (2022) → mất ý nghĩa độ cong (2025: β₂ = −0,16, p = ,42), kèm tương tác DAI Tier-2 (UPI) âm — bằng chứng đầu tiên rằng chuyển đổi thể chế cực mạnh có thể hòa tan (chứ không chỉ dịch chuyển) ngưỡng. Đích MIR/IJOEM; kế thừa công trình tiền đề Do &amp; Phan (2025, IntechOpen).</w:t>
       </w:r>
     </w:p>
-    <w:bookmarkEnd w:id="44"/>
-    <w:bookmarkStart w:id="45" w:name="X9556672229511acc75e7a88561876b51568dedf"/>
+    <w:bookmarkEnd w:id="45"/>
+    <w:bookmarkStart w:id="46" w:name="X9556672229511acc75e7a88561876b51568dedf"/>
     <w:p>
       <w:pPr>
         <w:pStyle w:val="Heading3"/>
@@ -2903,8 +3002,8 @@
         <w:t xml:space="preserve">(family of context-dependent curves), với turning point là hàm số giảm dần của chất lượng thể chế theo ICRV — thể chế càng mạnh, turning point càng sớm (FSTS thấp hơn).</w:t>
       </w:r>
     </w:p>
-    <w:bookmarkEnd w:id="45"/>
-    <w:bookmarkStart w:id="46" w:name="X0e99b1254b4b67b0d58ad32605b3382cafdc23f"/>
+    <w:bookmarkEnd w:id="46"/>
+    <w:bookmarkStart w:id="47" w:name="X0e99b1254b4b67b0d58ad32605b3382cafdc23f"/>
     <w:p>
       <w:pPr>
         <w:pStyle w:val="Heading3"/>
@@ -2929,8 +3028,8 @@
         <w:t xml:space="preserve">Về thực tiễn, luận án cung cấp cơ sở để nhà hoạch định chính sách và nhà quản trị doanh nghiệp tại từng bối cảnh ICRV cụ thể hiệu chỉnh chiến lược quốc tế hóa phù hợp — không áp dụng máy móc bài học từ Singapore hay Nhật Bản vào bối cảnh Việt Nam hay SIDS, mà nhận ra sự phụ thuộc bối cảnh như là nguyên lý căn bản trong hoạch định chiến lược quốc tế hóa.</w:t>
       </w:r>
     </w:p>
-    <w:bookmarkEnd w:id="46"/>
-    <w:bookmarkStart w:id="47" w:name="X419817a82cb35cfdb5a0df5261d5a194f2fd9ca"/>
+    <w:bookmarkEnd w:id="47"/>
+    <w:bookmarkStart w:id="48" w:name="X419817a82cb35cfdb5a0df5261d5a194f2fd9ca"/>
     <w:p>
       <w:pPr>
         <w:pStyle w:val="Heading3"/>
@@ -2967,9 +3066,9 @@
         </w:pict>
       </w:r>
     </w:p>
-    <w:bookmarkEnd w:id="47"/>
     <w:bookmarkEnd w:id="48"/>
     <w:bookmarkEnd w:id="49"/>
+    <w:bookmarkEnd w:id="50"/>
     <w:sectPr>
       <w:pgSz w:h="16838" w:w="11906"/>
       <w:pgMar w:bottom="1134" w:left="1701" w:right="1134" w:top="1134"/>

</xml_diff>